<commit_message>
subiendo video explicativo de funcionamiento
</commit_message>
<xml_diff>
--- a/Proyecto 1C/Informe.docx
+++ b/Proyecto 1C/Informe.docx
@@ -2918,6 +2918,18 @@
                 <w:lang w:val="en-US"/>
               </w:rPr>
             </w:pPr>
+          </w:p>
+          <w:p>
+            <w:pPr>
+              <w:tabs>
+                <w:tab w:val="left" w:pos="3279"/>
+              </w:tabs>
+              <w:ind w:right="-46"/>
+              <w:jc w:val="both"/>
+              <w:rPr>
+                <w:lang w:val="en-US"/>
+              </w:rPr>
+            </w:pPr>
             <w:r>
               <w:rPr>
                 <w:lang w:val="en-US"/>
@@ -3118,6 +3130,15 @@
             <w:tcW w:w="9016" w:type="dxa"/>
             <w:shd w:val="clear" w:color="auto" w:fill="auto"/>
           </w:tcPr>
+          <w:p>
+            <w:pPr>
+              <w:tabs>
+                <w:tab w:val="left" w:pos="3279"/>
+              </w:tabs>
+              <w:ind w:right="-46"/>
+              <w:jc w:val="both"/>
+            </w:pPr>
+          </w:p>
           <w:p>
             <w:pPr>
               <w:tabs>
@@ -13970,7 +13991,7 @@
     <w:p>
       <w:pPr>
         <w:keepNext/>
-        <w:ind w:right="-613"/>
+        <w:ind w:right="-330"/>
         <w:jc w:val="center"/>
       </w:pPr>
       <w:r>
@@ -13978,10 +13999,10 @@
           <w:noProof/>
         </w:rPr>
         <w:drawing>
-          <wp:inline distT="0" distB="0" distL="0" distR="0" wp14:anchorId="366A98F0" wp14:editId="34B9D30E">
-            <wp:extent cx="5730240" cy="3406140"/>
-            <wp:effectExtent l="0" t="0" r="3810" b="3810"/>
-            <wp:docPr id="1720652139" name="Imagen 5"/>
+          <wp:inline distT="0" distB="0" distL="0" distR="0" wp14:anchorId="3B3362AF" wp14:editId="61242D81">
+            <wp:extent cx="5729605" cy="3514725"/>
+            <wp:effectExtent l="0" t="0" r="4445" b="9525"/>
+            <wp:docPr id="1268284397" name="Imagen 9"/>
             <wp:cNvGraphicFramePr>
               <a:graphicFrameLocks xmlns:a="http://schemas.openxmlformats.org/drawingml/2006/main" noChangeAspect="1"/>
             </wp:cNvGraphicFramePr>
@@ -13989,7 +14010,7 @@
               <a:graphicData uri="http://schemas.openxmlformats.org/drawingml/2006/picture">
                 <pic:pic xmlns:pic="http://schemas.openxmlformats.org/drawingml/2006/picture">
                   <pic:nvPicPr>
-                    <pic:cNvPr id="0" name="Picture 5"/>
+                    <pic:cNvPr id="0" name="Picture 9"/>
                     <pic:cNvPicPr>
                       <a:picLocks noChangeAspect="1" noChangeArrowheads="1"/>
                     </pic:cNvPicPr>
@@ -14010,7 +14031,7 @@
                   <pic:spPr bwMode="auto">
                     <a:xfrm>
                       <a:off x="0" y="0"/>
-                      <a:ext cx="5730240" cy="3406140"/>
+                      <a:ext cx="5729605" cy="3514725"/>
                     </a:xfrm>
                     <a:prstGeom prst="rect">
                       <a:avLst/>
@@ -14096,10 +14117,10 @@
           <w:noProof/>
         </w:rPr>
         <w:drawing>
-          <wp:inline distT="0" distB="0" distL="0" distR="0" wp14:anchorId="2F9EB6F2" wp14:editId="089A1A71">
-            <wp:extent cx="5730240" cy="3101340"/>
-            <wp:effectExtent l="0" t="0" r="3810" b="3810"/>
-            <wp:docPr id="1649724593" name="Imagen 6"/>
+          <wp:inline distT="0" distB="0" distL="0" distR="0" wp14:anchorId="5D9EA6A1" wp14:editId="71340ACD">
+            <wp:extent cx="5729605" cy="3018155"/>
+            <wp:effectExtent l="0" t="0" r="4445" b="0"/>
+            <wp:docPr id="1996541865" name="Imagen 10"/>
             <wp:cNvGraphicFramePr>
               <a:graphicFrameLocks xmlns:a="http://schemas.openxmlformats.org/drawingml/2006/main" noChangeAspect="1"/>
             </wp:cNvGraphicFramePr>
@@ -14107,7 +14128,7 @@
               <a:graphicData uri="http://schemas.openxmlformats.org/drawingml/2006/picture">
                 <pic:pic xmlns:pic="http://schemas.openxmlformats.org/drawingml/2006/picture">
                   <pic:nvPicPr>
-                    <pic:cNvPr id="0" name="Picture 6"/>
+                    <pic:cNvPr id="0" name="Picture 10"/>
                     <pic:cNvPicPr>
                       <a:picLocks noChangeAspect="1" noChangeArrowheads="1"/>
                     </pic:cNvPicPr>
@@ -14128,7 +14149,7 @@
                   <pic:spPr bwMode="auto">
                     <a:xfrm>
                       <a:off x="0" y="0"/>
-                      <a:ext cx="5730240" cy="3101340"/>
+                      <a:ext cx="5729605" cy="3018155"/>
                     </a:xfrm>
                     <a:prstGeom prst="rect">
                       <a:avLst/>
@@ -14204,10 +14225,10 @@
           <w:noProof/>
         </w:rPr>
         <w:drawing>
-          <wp:inline distT="0" distB="0" distL="0" distR="0" wp14:anchorId="79086A67" wp14:editId="3B65605C">
-            <wp:extent cx="5820514" cy="3078480"/>
-            <wp:effectExtent l="0" t="0" r="8890" b="7620"/>
-            <wp:docPr id="1253220382" name="Imagen 7"/>
+          <wp:inline distT="0" distB="0" distL="0" distR="0" wp14:anchorId="54F85011" wp14:editId="249B3459">
+            <wp:extent cx="5602682" cy="3321212"/>
+            <wp:effectExtent l="0" t="0" r="0" b="0"/>
+            <wp:docPr id="14281042" name="Imagen 11"/>
             <wp:cNvGraphicFramePr>
               <a:graphicFrameLocks xmlns:a="http://schemas.openxmlformats.org/drawingml/2006/main" noChangeAspect="1"/>
             </wp:cNvGraphicFramePr>
@@ -14215,12 +14236,12 @@
               <a:graphicData uri="http://schemas.openxmlformats.org/drawingml/2006/picture">
                 <pic:pic xmlns:pic="http://schemas.openxmlformats.org/drawingml/2006/picture">
                   <pic:nvPicPr>
-                    <pic:cNvPr id="0" name="Picture 7"/>
+                    <pic:cNvPr id="0" name="Picture 11"/>
                     <pic:cNvPicPr>
                       <a:picLocks noChangeAspect="1" noChangeArrowheads="1"/>
                     </pic:cNvPicPr>
                   </pic:nvPicPr>
-                  <pic:blipFill rotWithShape="1">
+                  <pic:blipFill>
                     <a:blip r:embed="rId19" cstate="print">
                       <a:extLst>
                         <a:ext uri="{28A0092B-C50C-407E-A947-70E740481C1C}">
@@ -14228,7 +14249,7 @@
                         </a:ext>
                       </a:extLst>
                     </a:blip>
-                    <a:srcRect l="4920" t="9220" r="3060" b="4256"/>
+                    <a:srcRect/>
                     <a:stretch>
                       <a:fillRect/>
                     </a:stretch>
@@ -14236,7 +14257,7 @@
                   <pic:spPr bwMode="auto">
                     <a:xfrm>
                       <a:off x="0" y="0"/>
-                      <a:ext cx="5829525" cy="3083246"/>
+                      <a:ext cx="5615433" cy="3328770"/>
                     </a:xfrm>
                     <a:prstGeom prst="rect">
                       <a:avLst/>
@@ -14245,11 +14266,6 @@
                     <a:ln>
                       <a:noFill/>
                     </a:ln>
-                    <a:extLst>
-                      <a:ext uri="{53640926-AAD7-44D8-BBD7-CCE9431645EC}">
-                        <a14:shadowObscured xmlns:a14="http://schemas.microsoft.com/office/drawing/2010/main"/>
-                      </a:ext>
-                    </a:extLst>
                   </pic:spPr>
                 </pic:pic>
               </a:graphicData>

</xml_diff>

<commit_message>
Enlaces del indice completado
</commit_message>
<xml_diff>
--- a/Proyecto 1C/Informe.docx
+++ b/Proyecto 1C/Informe.docx
@@ -3664,29 +3664,11 @@
         <w:t>impulsaron</w:t>
       </w:r>
       <w:r>
-        <w:t xml:space="preserve"> el uso generalizado de las fuentes de alimentación conmutadas (Switch </w:t>
-      </w:r>
-      <w:proofErr w:type="spellStart"/>
-      <w:r>
-        <w:t>Mode</w:t>
-      </w:r>
-      <w:proofErr w:type="spellEnd"/>
-      <w:r>
-        <w:t xml:space="preserve"> </w:t>
-      </w:r>
-      <w:proofErr w:type="spellStart"/>
-      <w:r>
-        <w:t>Power</w:t>
-      </w:r>
-      <w:proofErr w:type="spellEnd"/>
-      <w:r>
-        <w:t xml:space="preserve"> </w:t>
-      </w:r>
-      <w:proofErr w:type="spellStart"/>
-      <w:r>
-        <w:t>Supplies</w:t>
-      </w:r>
-      <w:proofErr w:type="spellEnd"/>
+        <w:t xml:space="preserve"> el uso generalizado de las fuentes de alimentación conmutadas (Switch Mode </w:t>
+      </w:r>
+      <w:r>
+        <w:t>Power Supplies</w:t>
+      </w:r>
       <w:r>
         <w:t xml:space="preserve">) </w:t>
       </w:r>
@@ -3778,13 +3760,8 @@
       <w:r>
         <w:t xml:space="preserve">como los convertidores </w:t>
       </w:r>
-      <w:proofErr w:type="spellStart"/>
-      <w:r>
-        <w:t>Flyback</w:t>
-      </w:r>
-      <w:proofErr w:type="spellEnd"/>
-      <w:r>
-        <w:t xml:space="preserve"> </w:t>
+      <w:r>
+        <w:t xml:space="preserve">Flyback </w:t>
       </w:r>
       <w:r>
         <w:t xml:space="preserve">y </w:t>
@@ -4484,7 +4461,23 @@
               <w:sz w:val="32"/>
               <w:szCs w:val="32"/>
             </w:rPr>
-            <m:t>=D∙</m:t>
+            <m:t>=</m:t>
+          </m:r>
+          <m:r>
+            <w:rPr>
+              <w:rFonts w:ascii="Cambria Math" w:hAnsi="Cambria Math"/>
+              <w:sz w:val="32"/>
+              <w:szCs w:val="32"/>
+            </w:rPr>
+            <m:t>D</m:t>
+          </m:r>
+          <m:r>
+            <w:rPr>
+              <w:rFonts w:ascii="Cambria Math" w:hAnsi="Cambria Math"/>
+              <w:sz w:val="32"/>
+              <w:szCs w:val="32"/>
+            </w:rPr>
+            <m:t>∙</m:t>
           </m:r>
           <m:sSub>
             <m:sSubPr>
@@ -6899,7 +6892,23 @@
                     <w:sz w:val="24"/>
                     <w:szCs w:val="24"/>
                   </w:rPr>
-                  <m:t>=T-</m:t>
+                  <m:t>=</m:t>
+                </m:r>
+                <m:r>
+                  <w:rPr>
+                    <w:rFonts w:ascii="Cambria Math" w:hAnsi="Cambria Math"/>
+                    <w:sz w:val="24"/>
+                    <w:szCs w:val="24"/>
+                  </w:rPr>
+                  <m:t>T</m:t>
+                </m:r>
+                <m:r>
+                  <w:rPr>
+                    <w:rFonts w:ascii="Cambria Math" w:hAnsi="Cambria Math"/>
+                    <w:sz w:val="24"/>
+                    <w:szCs w:val="24"/>
+                  </w:rPr>
+                  <m:t>-</m:t>
                 </m:r>
                 <m:sSub>
                   <m:sSubPr>
@@ -7045,7 +7054,15 @@
                         <w:sz w:val="24"/>
                         <w:szCs w:val="24"/>
                       </w:rPr>
-                      <m:t>-5</m:t>
+                      <m:t>-</m:t>
+                    </m:r>
+                    <m:r>
+                      <w:rPr>
+                        <w:rFonts w:ascii="Cambria Math" w:hAnsi="Cambria Math"/>
+                        <w:sz w:val="24"/>
+                        <w:szCs w:val="24"/>
+                      </w:rPr>
+                      <m:t>5</m:t>
                     </m:r>
                   </m:sup>
                 </m:sSup>
@@ -7184,7 +7201,15 @@
                             <w:sz w:val="24"/>
                             <w:szCs w:val="24"/>
                           </w:rPr>
-                          <m:t>switch</m:t>
+                          <m:t>switc</m:t>
+                        </m:r>
+                        <m:r>
+                          <w:rPr>
+                            <w:rFonts w:ascii="Cambria Math" w:hAnsi="Cambria Math"/>
+                            <w:sz w:val="24"/>
+                            <w:szCs w:val="24"/>
+                          </w:rPr>
+                          <m:t>h</m:t>
                         </m:r>
                       </m:e>
                     </m:d>
@@ -7246,7 +7271,23 @@
                             <w:sz w:val="24"/>
                             <w:szCs w:val="24"/>
                           </w:rPr>
-                          <m:t>máx</m:t>
+                          <m:t>m</m:t>
+                        </m:r>
+                        <m:r>
+                          <w:rPr>
+                            <w:rFonts w:ascii="Cambria Math" w:hAnsi="Cambria Math"/>
+                            <w:sz w:val="24"/>
+                            <w:szCs w:val="24"/>
+                          </w:rPr>
+                          <m:t>á</m:t>
+                        </m:r>
+                        <m:r>
+                          <w:rPr>
+                            <w:rFonts w:ascii="Cambria Math" w:hAnsi="Cambria Math"/>
+                            <w:sz w:val="24"/>
+                            <w:szCs w:val="24"/>
+                          </w:rPr>
+                          <m:t>x</m:t>
                         </m:r>
                       </m:e>
                     </m:d>
@@ -7406,7 +7447,15 @@
                                 <w:sz w:val="24"/>
                                 <w:szCs w:val="24"/>
                               </w:rPr>
-                              <m:t>switch</m:t>
+                              <m:t>switc</m:t>
+                            </m:r>
+                            <m:r>
+                              <w:rPr>
+                                <w:rFonts w:ascii="Cambria Math" w:hAnsi="Cambria Math"/>
+                                <w:sz w:val="24"/>
+                                <w:szCs w:val="24"/>
+                              </w:rPr>
+                              <m:t>h</m:t>
                             </m:r>
                           </m:e>
                         </m:d>
@@ -7488,7 +7537,23 @@
                         <w:sz w:val="24"/>
                         <w:szCs w:val="24"/>
                       </w:rPr>
-                      <m:t>mín</m:t>
+                      <m:t>m</m:t>
+                    </m:r>
+                    <m:r>
+                      <w:rPr>
+                        <w:rFonts w:ascii="Cambria Math" w:hAnsi="Cambria Math"/>
+                        <w:sz w:val="24"/>
+                        <w:szCs w:val="24"/>
+                      </w:rPr>
+                      <m:t>í</m:t>
+                    </m:r>
+                    <m:r>
+                      <w:rPr>
+                        <w:rFonts w:ascii="Cambria Math" w:hAnsi="Cambria Math"/>
+                        <w:sz w:val="24"/>
+                        <w:szCs w:val="24"/>
+                      </w:rPr>
+                      <m:t>n</m:t>
                     </m:r>
                   </m:sub>
                 </m:sSub>
@@ -7686,7 +7751,15 @@
                                     <w:sz w:val="24"/>
                                     <w:szCs w:val="24"/>
                                   </w:rPr>
-                                  <m:t>switch</m:t>
+                                  <m:t>switc</m:t>
+                                </m:r>
+                                <m:r>
+                                  <w:rPr>
+                                    <w:rFonts w:ascii="Cambria Math" w:hAnsi="Cambria Math"/>
+                                    <w:sz w:val="24"/>
+                                    <w:szCs w:val="24"/>
+                                  </w:rPr>
+                                  <m:t>h</m:t>
                                 </m:r>
                               </m:e>
                             </m:d>
@@ -7880,7 +7953,15 @@
                                 <w:sz w:val="24"/>
                                 <w:szCs w:val="24"/>
                               </w:rPr>
-                              <m:t>switch</m:t>
+                              <m:t>switc</m:t>
+                            </m:r>
+                            <m:r>
+                              <w:rPr>
+                                <w:rFonts w:ascii="Cambria Math" w:hAnsi="Cambria Math"/>
+                                <w:sz w:val="24"/>
+                                <w:szCs w:val="24"/>
+                              </w:rPr>
+                              <m:t>h</m:t>
                             </m:r>
                           </m:e>
                         </m:d>
@@ -8662,7 +8743,25 @@
                 <w:rPr>
                   <w:rFonts w:ascii="Cambria Math" w:eastAsiaTheme="majorEastAsia" w:hAnsi="Cambria Math" w:cstheme="majorBidi"/>
                 </w:rPr>
-                <m:t>5V+0.5V</m:t>
+                <m:t>5</m:t>
+              </m:r>
+              <m:r>
+                <w:rPr>
+                  <w:rFonts w:ascii="Cambria Math" w:eastAsiaTheme="majorEastAsia" w:hAnsi="Cambria Math" w:cstheme="majorBidi"/>
+                </w:rPr>
+                <m:t>V</m:t>
+              </m:r>
+              <m:r>
+                <w:rPr>
+                  <w:rFonts w:ascii="Cambria Math" w:eastAsiaTheme="majorEastAsia" w:hAnsi="Cambria Math" w:cstheme="majorBidi"/>
+                </w:rPr>
+                <m:t>+0.5</m:t>
+              </m:r>
+              <m:r>
+                <w:rPr>
+                  <w:rFonts w:ascii="Cambria Math" w:eastAsiaTheme="majorEastAsia" w:hAnsi="Cambria Math" w:cstheme="majorBidi"/>
+                </w:rPr>
+                <m:t>V</m:t>
               </m:r>
             </m:num>
             <m:den>
@@ -8670,7 +8769,49 @@
                 <w:rPr>
                   <w:rFonts w:ascii="Cambria Math" w:eastAsiaTheme="majorEastAsia" w:hAnsi="Cambria Math" w:cstheme="majorBidi"/>
                 </w:rPr>
-                <m:t>12V-1V-5V</m:t>
+                <m:t>12</m:t>
+              </m:r>
+              <m:r>
+                <w:rPr>
+                  <w:rFonts w:ascii="Cambria Math" w:eastAsiaTheme="majorEastAsia" w:hAnsi="Cambria Math" w:cstheme="majorBidi"/>
+                </w:rPr>
+                <m:t>V</m:t>
+              </m:r>
+              <m:r>
+                <w:rPr>
+                  <w:rFonts w:ascii="Cambria Math" w:eastAsiaTheme="majorEastAsia" w:hAnsi="Cambria Math" w:cstheme="majorBidi"/>
+                </w:rPr>
+                <m:t>-</m:t>
+              </m:r>
+              <m:r>
+                <w:rPr>
+                  <w:rFonts w:ascii="Cambria Math" w:eastAsiaTheme="majorEastAsia" w:hAnsi="Cambria Math" w:cstheme="majorBidi"/>
+                </w:rPr>
+                <m:t>1</m:t>
+              </m:r>
+              <m:r>
+                <w:rPr>
+                  <w:rFonts w:ascii="Cambria Math" w:eastAsiaTheme="majorEastAsia" w:hAnsi="Cambria Math" w:cstheme="majorBidi"/>
+                </w:rPr>
+                <m:t>V</m:t>
+              </m:r>
+              <m:r>
+                <w:rPr>
+                  <w:rFonts w:ascii="Cambria Math" w:eastAsiaTheme="majorEastAsia" w:hAnsi="Cambria Math" w:cstheme="majorBidi"/>
+                </w:rPr>
+                <m:t>-</m:t>
+              </m:r>
+              <m:r>
+                <w:rPr>
+                  <w:rFonts w:ascii="Cambria Math" w:eastAsiaTheme="majorEastAsia" w:hAnsi="Cambria Math" w:cstheme="majorBidi"/>
+                </w:rPr>
+                <m:t>5</m:t>
+              </m:r>
+              <m:r>
+                <w:rPr>
+                  <w:rFonts w:ascii="Cambria Math" w:eastAsiaTheme="majorEastAsia" w:hAnsi="Cambria Math" w:cstheme="majorBidi"/>
+                </w:rPr>
+                <m:t>V</m:t>
               </m:r>
             </m:den>
           </m:f>
@@ -8928,7 +9069,13 @@
                 <w:rPr>
                   <w:rFonts w:ascii="Cambria Math" w:eastAsiaTheme="majorEastAsia" w:hAnsi="Cambria Math" w:cstheme="majorBidi"/>
                 </w:rPr>
-                <m:t>25μs</m:t>
+                <m:t>25</m:t>
+              </m:r>
+              <m:r>
+                <w:rPr>
+                  <w:rFonts w:ascii="Cambria Math" w:eastAsiaTheme="majorEastAsia" w:hAnsi="Cambria Math" w:cstheme="majorBidi"/>
+                </w:rPr>
+                <m:t>μs</m:t>
               </m:r>
             </m:num>
             <m:den>
@@ -8944,7 +9091,13 @@
             <w:rPr>
               <w:rFonts w:ascii="Cambria Math" w:eastAsiaTheme="majorEastAsia" w:hAnsi="Cambria Math" w:cstheme="majorBidi"/>
             </w:rPr>
-            <m:t>=13.04μs</m:t>
+            <m:t>=13.04</m:t>
+          </m:r>
+          <m:r>
+            <w:rPr>
+              <w:rFonts w:ascii="Cambria Math" w:eastAsiaTheme="majorEastAsia" w:hAnsi="Cambria Math" w:cstheme="majorBidi"/>
+            </w:rPr>
+            <m:t>μs</m:t>
           </m:r>
         </m:oMath>
       </m:oMathPara>
@@ -8987,7 +9140,19 @@
             <w:rPr>
               <w:rFonts w:ascii="Cambria Math" w:eastAsiaTheme="majorEastAsia" w:hAnsi="Cambria Math" w:cstheme="majorBidi"/>
             </w:rPr>
-            <m:t>=T-</m:t>
+            <m:t>=</m:t>
+          </m:r>
+          <m:r>
+            <w:rPr>
+              <w:rFonts w:ascii="Cambria Math" w:eastAsiaTheme="majorEastAsia" w:hAnsi="Cambria Math" w:cstheme="majorBidi"/>
+            </w:rPr>
+            <m:t>T</m:t>
+          </m:r>
+          <m:r>
+            <w:rPr>
+              <w:rFonts w:ascii="Cambria Math" w:eastAsiaTheme="majorEastAsia" w:hAnsi="Cambria Math" w:cstheme="majorBidi"/>
+            </w:rPr>
+            <m:t>-</m:t>
           </m:r>
           <m:sSub>
             <m:sSubPr>
@@ -9019,7 +9184,43 @@
             <w:rPr>
               <w:rFonts w:ascii="Cambria Math" w:eastAsiaTheme="majorEastAsia" w:hAnsi="Cambria Math" w:cstheme="majorBidi"/>
             </w:rPr>
-            <m:t>=25μs-13.04μs= 11.96μs</m:t>
+            <m:t>=25</m:t>
+          </m:r>
+          <m:r>
+            <w:rPr>
+              <w:rFonts w:ascii="Cambria Math" w:eastAsiaTheme="majorEastAsia" w:hAnsi="Cambria Math" w:cstheme="majorBidi"/>
+            </w:rPr>
+            <m:t>μs</m:t>
+          </m:r>
+          <m:r>
+            <w:rPr>
+              <w:rFonts w:ascii="Cambria Math" w:eastAsiaTheme="majorEastAsia" w:hAnsi="Cambria Math" w:cstheme="majorBidi"/>
+            </w:rPr>
+            <m:t>-</m:t>
+          </m:r>
+          <m:r>
+            <w:rPr>
+              <w:rFonts w:ascii="Cambria Math" w:eastAsiaTheme="majorEastAsia" w:hAnsi="Cambria Math" w:cstheme="majorBidi"/>
+            </w:rPr>
+            <m:t>13.04</m:t>
+          </m:r>
+          <m:r>
+            <w:rPr>
+              <w:rFonts w:ascii="Cambria Math" w:eastAsiaTheme="majorEastAsia" w:hAnsi="Cambria Math" w:cstheme="majorBidi"/>
+            </w:rPr>
+            <m:t>μs</m:t>
+          </m:r>
+          <m:r>
+            <w:rPr>
+              <w:rFonts w:ascii="Cambria Math" w:eastAsiaTheme="majorEastAsia" w:hAnsi="Cambria Math" w:cstheme="majorBidi"/>
+            </w:rPr>
+            <m:t>= 11.96</m:t>
+          </m:r>
+          <m:r>
+            <w:rPr>
+              <w:rFonts w:ascii="Cambria Math" w:eastAsiaTheme="majorEastAsia" w:hAnsi="Cambria Math" w:cstheme="majorBidi"/>
+            </w:rPr>
+            <m:t>μs</m:t>
           </m:r>
         </m:oMath>
       </m:oMathPara>
@@ -9162,7 +9363,13 @@
                 <w:rPr>
                   <w:rFonts w:ascii="Cambria Math" w:eastAsiaTheme="majorEastAsia" w:hAnsi="Cambria Math" w:cstheme="majorBidi"/>
                 </w:rPr>
-                <m:t>-5</m:t>
+                <m:t>-</m:t>
+              </m:r>
+              <m:r>
+                <w:rPr>
+                  <w:rFonts w:ascii="Cambria Math" w:eastAsiaTheme="majorEastAsia" w:hAnsi="Cambria Math" w:cstheme="majorBidi"/>
+                </w:rPr>
+                <m:t>5</m:t>
               </m:r>
             </m:sup>
           </m:sSup>
@@ -9228,7 +9435,13 @@
                 <w:rPr>
                   <w:rFonts w:ascii="Cambria Math" w:eastAsiaTheme="majorEastAsia" w:hAnsi="Cambria Math" w:cstheme="majorBidi"/>
                 </w:rPr>
-                <m:t>-5</m:t>
+                <m:t>-</m:t>
+              </m:r>
+              <m:r>
+                <w:rPr>
+                  <w:rFonts w:ascii="Cambria Math" w:eastAsiaTheme="majorEastAsia" w:hAnsi="Cambria Math" w:cstheme="majorBidi"/>
+                </w:rPr>
+                <m:t>5</m:t>
               </m:r>
             </m:sup>
           </m:sSup>
@@ -9236,7 +9449,25 @@
             <w:rPr>
               <w:rFonts w:ascii="Cambria Math" w:eastAsiaTheme="majorEastAsia" w:hAnsi="Cambria Math" w:cstheme="majorBidi"/>
             </w:rPr>
-            <m:t>∙ 11.96μs=47.84×</m:t>
+            <m:t>∙</m:t>
+          </m:r>
+          <m:r>
+            <w:rPr>
+              <w:rFonts w:ascii="Cambria Math" w:eastAsiaTheme="majorEastAsia" w:hAnsi="Cambria Math" w:cstheme="majorBidi"/>
+            </w:rPr>
+            <m:t xml:space="preserve"> 11.96</m:t>
+          </m:r>
+          <m:r>
+            <w:rPr>
+              <w:rFonts w:ascii="Cambria Math" w:eastAsiaTheme="majorEastAsia" w:hAnsi="Cambria Math" w:cstheme="majorBidi"/>
+            </w:rPr>
+            <m:t>μs</m:t>
+          </m:r>
+          <m:r>
+            <w:rPr>
+              <w:rFonts w:ascii="Cambria Math" w:eastAsiaTheme="majorEastAsia" w:hAnsi="Cambria Math" w:cstheme="majorBidi"/>
+            </w:rPr>
+            <m:t>=47.84×</m:t>
           </m:r>
           <m:sSup>
             <m:sSupPr>
@@ -9261,7 +9492,13 @@
                 <w:rPr>
                   <w:rFonts w:ascii="Cambria Math" w:eastAsiaTheme="majorEastAsia" w:hAnsi="Cambria Math" w:cstheme="majorBidi"/>
                 </w:rPr>
-                <m:t>-11</m:t>
+                <m:t>-</m:t>
+              </m:r>
+              <m:r>
+                <w:rPr>
+                  <w:rFonts w:ascii="Cambria Math" w:eastAsiaTheme="majorEastAsia" w:hAnsi="Cambria Math" w:cstheme="majorBidi"/>
+                </w:rPr>
+                <m:t>11</m:t>
               </m:r>
             </m:sup>
           </m:sSup>
@@ -9314,7 +9551,19 @@
             <w:rPr>
               <w:rFonts w:ascii="Cambria Math" w:eastAsiaTheme="majorEastAsia" w:hAnsi="Cambria Math" w:cstheme="majorBidi"/>
             </w:rPr>
-            <m:t xml:space="preserve">=478.4 pF </m:t>
+            <m:t xml:space="preserve">=478.4 </m:t>
+          </m:r>
+          <m:r>
+            <w:rPr>
+              <w:rFonts w:ascii="Cambria Math" w:eastAsiaTheme="majorEastAsia" w:hAnsi="Cambria Math" w:cstheme="majorBidi"/>
+            </w:rPr>
+            <m:t>pF</m:t>
+          </m:r>
+          <m:r>
+            <w:rPr>
+              <w:rFonts w:ascii="Cambria Math" w:eastAsiaTheme="majorEastAsia" w:hAnsi="Cambria Math" w:cstheme="majorBidi"/>
+            </w:rPr>
+            <m:t xml:space="preserve"> </m:t>
           </m:r>
           <m:d>
             <m:dPr>
@@ -9331,7 +9580,19 @@
                 <w:rPr>
                   <w:rFonts w:ascii="Cambria Math" w:eastAsiaTheme="majorEastAsia" w:hAnsi="Cambria Math" w:cstheme="majorBidi"/>
                 </w:rPr>
-                <m:t>Valor exacto</m:t>
+                <m:t>Valor</m:t>
+              </m:r>
+              <m:r>
+                <w:rPr>
+                  <w:rFonts w:ascii="Cambria Math" w:eastAsiaTheme="majorEastAsia" w:hAnsi="Cambria Math" w:cstheme="majorBidi"/>
+                </w:rPr>
+                <m:t xml:space="preserve"> </m:t>
+              </m:r>
+              <m:r>
+                <w:rPr>
+                  <w:rFonts w:ascii="Cambria Math" w:eastAsiaTheme="majorEastAsia" w:hAnsi="Cambria Math" w:cstheme="majorBidi"/>
+                </w:rPr>
+                <m:t>exacto</m:t>
               </m:r>
             </m:e>
           </m:d>
@@ -9399,7 +9660,43 @@
             <w:rPr>
               <w:rFonts w:ascii="Cambria Math" w:eastAsiaTheme="majorEastAsia" w:hAnsi="Cambria Math" w:cstheme="majorBidi"/>
             </w:rPr>
-            <m:t>≈470 pF (Valor comercial)</m:t>
+            <m:t xml:space="preserve">≈470 </m:t>
+          </m:r>
+          <m:r>
+            <w:rPr>
+              <w:rFonts w:ascii="Cambria Math" w:eastAsiaTheme="majorEastAsia" w:hAnsi="Cambria Math" w:cstheme="majorBidi"/>
+            </w:rPr>
+            <m:t>pF</m:t>
+          </m:r>
+          <m:r>
+            <w:rPr>
+              <w:rFonts w:ascii="Cambria Math" w:eastAsiaTheme="majorEastAsia" w:hAnsi="Cambria Math" w:cstheme="majorBidi"/>
+            </w:rPr>
+            <m:t xml:space="preserve"> (</m:t>
+          </m:r>
+          <m:r>
+            <w:rPr>
+              <w:rFonts w:ascii="Cambria Math" w:eastAsiaTheme="majorEastAsia" w:hAnsi="Cambria Math" w:cstheme="majorBidi"/>
+            </w:rPr>
+            <m:t>Valor</m:t>
+          </m:r>
+          <m:r>
+            <w:rPr>
+              <w:rFonts w:ascii="Cambria Math" w:eastAsiaTheme="majorEastAsia" w:hAnsi="Cambria Math" w:cstheme="majorBidi"/>
+            </w:rPr>
+            <m:t xml:space="preserve"> </m:t>
+          </m:r>
+          <m:r>
+            <w:rPr>
+              <w:rFonts w:ascii="Cambria Math" w:eastAsiaTheme="majorEastAsia" w:hAnsi="Cambria Math" w:cstheme="majorBidi"/>
+            </w:rPr>
+            <m:t>comercial</m:t>
+          </m:r>
+          <m:r>
+            <w:rPr>
+              <w:rFonts w:ascii="Cambria Math" w:eastAsiaTheme="majorEastAsia" w:hAnsi="Cambria Math" w:cstheme="majorBidi"/>
+            </w:rPr>
+            <m:t>)</m:t>
           </m:r>
         </m:oMath>
       </m:oMathPara>
@@ -9585,7 +9882,13 @@
                     <w:rPr>
                       <w:rFonts w:ascii="Cambria Math" w:eastAsiaTheme="majorEastAsia" w:hAnsi="Cambria Math" w:cstheme="majorBidi"/>
                     </w:rPr>
-                    <m:t>-5</m:t>
+                    <m:t>-</m:t>
+                  </m:r>
+                  <m:r>
+                    <w:rPr>
+                      <w:rFonts w:ascii="Cambria Math" w:eastAsiaTheme="majorEastAsia" w:hAnsi="Cambria Math" w:cstheme="majorBidi"/>
+                    </w:rPr>
+                    <m:t>5</m:t>
                   </m:r>
                 </m:sup>
               </m:sSup>
@@ -9637,7 +9940,13 @@
                     <w:rPr>
                       <w:rFonts w:ascii="Cambria Math" w:eastAsiaTheme="majorEastAsia" w:hAnsi="Cambria Math" w:cstheme="majorBidi"/>
                     </w:rPr>
-                    <m:t>-12</m:t>
+                    <m:t>-</m:t>
+                  </m:r>
+                  <m:r>
+                    <w:rPr>
+                      <w:rFonts w:ascii="Cambria Math" w:eastAsiaTheme="majorEastAsia" w:hAnsi="Cambria Math" w:cstheme="majorBidi"/>
+                    </w:rPr>
+                    <m:t>12</m:t>
                   </m:r>
                 </m:sup>
               </m:sSup>
@@ -9678,7 +9987,13 @@
                     <w:rPr>
                       <w:rFonts w:ascii="Cambria Math" w:eastAsiaTheme="majorEastAsia" w:hAnsi="Cambria Math" w:cstheme="majorBidi"/>
                     </w:rPr>
-                    <m:t>-5</m:t>
+                    <m:t>-</m:t>
+                  </m:r>
+                  <m:r>
+                    <w:rPr>
+                      <w:rFonts w:ascii="Cambria Math" w:eastAsiaTheme="majorEastAsia" w:hAnsi="Cambria Math" w:cstheme="majorBidi"/>
+                    </w:rPr>
+                    <m:t>5</m:t>
                   </m:r>
                 </m:sup>
               </m:sSup>
@@ -9688,7 +10003,13 @@
             <w:rPr>
               <w:rFonts w:ascii="Cambria Math" w:eastAsiaTheme="majorEastAsia" w:hAnsi="Cambria Math" w:cstheme="majorBidi"/>
             </w:rPr>
-            <m:t>=11.75μs</m:t>
+            <m:t>=11.75</m:t>
+          </m:r>
+          <m:r>
+            <w:rPr>
+              <w:rFonts w:ascii="Cambria Math" w:eastAsiaTheme="majorEastAsia" w:hAnsi="Cambria Math" w:cstheme="majorBidi"/>
+            </w:rPr>
+            <m:t>μs</m:t>
           </m:r>
         </m:oMath>
       </m:oMathPara>
@@ -9927,7 +10248,19 @@
                     <w:rPr>
                       <w:rFonts w:ascii="Cambria Math" w:eastAsiaTheme="majorEastAsia" w:hAnsi="Cambria Math" w:cstheme="majorBidi"/>
                     </w:rPr>
-                    <m:t>máx</m:t>
+                    <m:t>m</m:t>
+                  </m:r>
+                  <m:r>
+                    <w:rPr>
+                      <w:rFonts w:ascii="Cambria Math" w:eastAsiaTheme="majorEastAsia" w:hAnsi="Cambria Math" w:cstheme="majorBidi"/>
+                    </w:rPr>
+                    <m:t>á</m:t>
+                  </m:r>
+                  <m:r>
+                    <w:rPr>
+                      <w:rFonts w:ascii="Cambria Math" w:eastAsiaTheme="majorEastAsia" w:hAnsi="Cambria Math" w:cstheme="majorBidi"/>
+                    </w:rPr>
+                    <m:t>x</m:t>
                   </m:r>
                 </m:e>
               </m:d>
@@ -9937,7 +10270,25 @@
             <w:rPr>
               <w:rFonts w:ascii="Cambria Math" w:eastAsiaTheme="majorEastAsia" w:hAnsi="Cambria Math" w:cstheme="majorBidi"/>
             </w:rPr>
-            <m:t>=2×1A=2A</m:t>
+            <m:t>=2×1</m:t>
+          </m:r>
+          <m:r>
+            <w:rPr>
+              <w:rFonts w:ascii="Cambria Math" w:eastAsiaTheme="majorEastAsia" w:hAnsi="Cambria Math" w:cstheme="majorBidi"/>
+            </w:rPr>
+            <m:t>A</m:t>
+          </m:r>
+          <m:r>
+            <w:rPr>
+              <w:rFonts w:ascii="Cambria Math" w:eastAsiaTheme="majorEastAsia" w:hAnsi="Cambria Math" w:cstheme="majorBidi"/>
+            </w:rPr>
+            <m:t>=2</m:t>
+          </m:r>
+          <m:r>
+            <w:rPr>
+              <w:rFonts w:ascii="Cambria Math" w:eastAsiaTheme="majorEastAsia" w:hAnsi="Cambria Math" w:cstheme="majorBidi"/>
+            </w:rPr>
+            <m:t>A</m:t>
           </m:r>
         </m:oMath>
       </m:oMathPara>
@@ -10138,7 +10489,13 @@
                 <w:rPr>
                   <w:rFonts w:ascii="Cambria Math" w:eastAsiaTheme="majorEastAsia" w:hAnsi="Cambria Math" w:cstheme="majorBidi"/>
                 </w:rPr>
-                <m:t>2A</m:t>
+                <m:t>2</m:t>
+              </m:r>
+              <m:r>
+                <w:rPr>
+                  <w:rFonts w:ascii="Cambria Math" w:eastAsiaTheme="majorEastAsia" w:hAnsi="Cambria Math" w:cstheme="majorBidi"/>
+                </w:rPr>
+                <m:t>A</m:t>
               </m:r>
             </m:den>
           </m:f>
@@ -10323,7 +10680,13 @@
                     <w:rPr>
                       <w:rFonts w:ascii="Cambria Math" w:eastAsiaTheme="majorEastAsia" w:hAnsi="Cambria Math" w:cstheme="majorBidi"/>
                     </w:rPr>
-                    <m:t>2A</m:t>
+                    <m:t>2</m:t>
+                  </m:r>
+                  <m:r>
+                    <w:rPr>
+                      <w:rFonts w:ascii="Cambria Math" w:eastAsiaTheme="majorEastAsia" w:hAnsi="Cambria Math" w:cstheme="majorBidi"/>
+                    </w:rPr>
+                    <m:t>A</m:t>
                   </m:r>
                 </m:e>
               </m:d>
@@ -10341,7 +10704,13 @@
             <w:rPr>
               <w:rFonts w:ascii="Cambria Math" w:eastAsiaTheme="majorEastAsia" w:hAnsi="Cambria Math" w:cstheme="majorBidi"/>
             </w:rPr>
-            <m:t>∙ 0.15</m:t>
+            <m:t>∙</m:t>
+          </m:r>
+          <m:r>
+            <w:rPr>
+              <w:rFonts w:ascii="Cambria Math" w:eastAsiaTheme="majorEastAsia" w:hAnsi="Cambria Math" w:cstheme="majorBidi"/>
+            </w:rPr>
+            <m:t xml:space="preserve"> 0.15</m:t>
           </m:r>
           <m:r>
             <m:rPr>
@@ -10356,7 +10725,13 @@
             <w:rPr>
               <w:rFonts w:ascii="Cambria Math" w:eastAsiaTheme="majorEastAsia" w:hAnsi="Cambria Math" w:cstheme="majorBidi"/>
             </w:rPr>
-            <m:t>=0.6W</m:t>
+            <m:t>=0.6</m:t>
+          </m:r>
+          <m:r>
+            <w:rPr>
+              <w:rFonts w:ascii="Cambria Math" w:eastAsiaTheme="majorEastAsia" w:hAnsi="Cambria Math" w:cstheme="majorBidi"/>
+            </w:rPr>
+            <m:t>W</m:t>
           </m:r>
         </m:oMath>
       </m:oMathPara>
@@ -10443,7 +10818,49 @@
             <w:rPr>
               <w:rFonts w:ascii="Cambria Math" w:eastAsiaTheme="majorEastAsia" w:hAnsi="Cambria Math" w:cstheme="majorBidi"/>
             </w:rPr>
-            <m:t>-1W (Valore comercial)</m:t>
+            <m:t>-</m:t>
+          </m:r>
+          <m:r>
+            <w:rPr>
+              <w:rFonts w:ascii="Cambria Math" w:eastAsiaTheme="majorEastAsia" w:hAnsi="Cambria Math" w:cstheme="majorBidi"/>
+            </w:rPr>
+            <m:t>1</m:t>
+          </m:r>
+          <m:r>
+            <w:rPr>
+              <w:rFonts w:ascii="Cambria Math" w:eastAsiaTheme="majorEastAsia" w:hAnsi="Cambria Math" w:cstheme="majorBidi"/>
+            </w:rPr>
+            <m:t>W</m:t>
+          </m:r>
+          <m:r>
+            <w:rPr>
+              <w:rFonts w:ascii="Cambria Math" w:eastAsiaTheme="majorEastAsia" w:hAnsi="Cambria Math" w:cstheme="majorBidi"/>
+            </w:rPr>
+            <m:t xml:space="preserve"> (</m:t>
+          </m:r>
+          <m:r>
+            <w:rPr>
+              <w:rFonts w:ascii="Cambria Math" w:eastAsiaTheme="majorEastAsia" w:hAnsi="Cambria Math" w:cstheme="majorBidi"/>
+            </w:rPr>
+            <m:t>Valore</m:t>
+          </m:r>
+          <m:r>
+            <w:rPr>
+              <w:rFonts w:ascii="Cambria Math" w:eastAsiaTheme="majorEastAsia" w:hAnsi="Cambria Math" w:cstheme="majorBidi"/>
+            </w:rPr>
+            <m:t xml:space="preserve"> </m:t>
+          </m:r>
+          <m:r>
+            <w:rPr>
+              <w:rFonts w:ascii="Cambria Math" w:eastAsiaTheme="majorEastAsia" w:hAnsi="Cambria Math" w:cstheme="majorBidi"/>
+            </w:rPr>
+            <m:t>comercial</m:t>
+          </m:r>
+          <m:r>
+            <w:rPr>
+              <w:rFonts w:ascii="Cambria Math" w:eastAsiaTheme="majorEastAsia" w:hAnsi="Cambria Math" w:cstheme="majorBidi"/>
+            </w:rPr>
+            <m:t>)</m:t>
           </m:r>
         </m:oMath>
       </m:oMathPara>
@@ -10556,7 +10973,19 @@
                 <w:rPr>
                   <w:rFonts w:ascii="Cambria Math" w:eastAsiaTheme="majorEastAsia" w:hAnsi="Cambria Math" w:cstheme="majorBidi"/>
                 </w:rPr>
-                <m:t>mín</m:t>
+                <m:t>m</m:t>
+              </m:r>
+              <m:r>
+                <w:rPr>
+                  <w:rFonts w:ascii="Cambria Math" w:eastAsiaTheme="majorEastAsia" w:hAnsi="Cambria Math" w:cstheme="majorBidi"/>
+                </w:rPr>
+                <m:t>í</m:t>
+              </m:r>
+              <m:r>
+                <w:rPr>
+                  <w:rFonts w:ascii="Cambria Math" w:eastAsiaTheme="majorEastAsia" w:hAnsi="Cambria Math" w:cstheme="majorBidi"/>
+                </w:rPr>
+                <m:t>n</m:t>
               </m:r>
             </m:sub>
           </m:sSub>
@@ -10779,7 +11208,49 @@
                     <w:rPr>
                       <w:rFonts w:ascii="Cambria Math" w:eastAsiaTheme="majorEastAsia" w:hAnsi="Cambria Math" w:cstheme="majorBidi"/>
                     </w:rPr>
-                    <m:t>12V-1V-5V</m:t>
+                    <m:t>12</m:t>
+                  </m:r>
+                  <m:r>
+                    <w:rPr>
+                      <w:rFonts w:ascii="Cambria Math" w:eastAsiaTheme="majorEastAsia" w:hAnsi="Cambria Math" w:cstheme="majorBidi"/>
+                    </w:rPr>
+                    <m:t>V</m:t>
+                  </m:r>
+                  <m:r>
+                    <w:rPr>
+                      <w:rFonts w:ascii="Cambria Math" w:eastAsiaTheme="majorEastAsia" w:hAnsi="Cambria Math" w:cstheme="majorBidi"/>
+                    </w:rPr>
+                    <m:t>-</m:t>
+                  </m:r>
+                  <m:r>
+                    <w:rPr>
+                      <w:rFonts w:ascii="Cambria Math" w:eastAsiaTheme="majorEastAsia" w:hAnsi="Cambria Math" w:cstheme="majorBidi"/>
+                    </w:rPr>
+                    <m:t>1</m:t>
+                  </m:r>
+                  <m:r>
+                    <w:rPr>
+                      <w:rFonts w:ascii="Cambria Math" w:eastAsiaTheme="majorEastAsia" w:hAnsi="Cambria Math" w:cstheme="majorBidi"/>
+                    </w:rPr>
+                    <m:t>V</m:t>
+                  </m:r>
+                  <m:r>
+                    <w:rPr>
+                      <w:rFonts w:ascii="Cambria Math" w:eastAsiaTheme="majorEastAsia" w:hAnsi="Cambria Math" w:cstheme="majorBidi"/>
+                    </w:rPr>
+                    <m:t>-</m:t>
+                  </m:r>
+                  <m:r>
+                    <w:rPr>
+                      <w:rFonts w:ascii="Cambria Math" w:eastAsiaTheme="majorEastAsia" w:hAnsi="Cambria Math" w:cstheme="majorBidi"/>
+                    </w:rPr>
+                    <m:t>5</m:t>
+                  </m:r>
+                  <m:r>
+                    <w:rPr>
+                      <w:rFonts w:ascii="Cambria Math" w:eastAsiaTheme="majorEastAsia" w:hAnsi="Cambria Math" w:cstheme="majorBidi"/>
+                    </w:rPr>
+                    <m:t>V</m:t>
                   </m:r>
                 </m:num>
                 <m:den>
@@ -10787,7 +11258,13 @@
                     <w:rPr>
                       <w:rFonts w:ascii="Cambria Math" w:eastAsiaTheme="majorEastAsia" w:hAnsi="Cambria Math" w:cstheme="majorBidi"/>
                     </w:rPr>
-                    <m:t>2A</m:t>
+                    <m:t>2</m:t>
+                  </m:r>
+                  <m:r>
+                    <w:rPr>
+                      <w:rFonts w:ascii="Cambria Math" w:eastAsiaTheme="majorEastAsia" w:hAnsi="Cambria Math" w:cstheme="majorBidi"/>
+                    </w:rPr>
+                    <m:t>A</m:t>
                   </m:r>
                 </m:den>
               </m:f>
@@ -10797,7 +11274,25 @@
             <w:rPr>
               <w:rFonts w:ascii="Cambria Math" w:eastAsiaTheme="majorEastAsia" w:hAnsi="Cambria Math" w:cstheme="majorBidi"/>
             </w:rPr>
-            <m:t>×11.96μs=35.88μH</m:t>
+            <m:t>×11.96</m:t>
+          </m:r>
+          <m:r>
+            <w:rPr>
+              <w:rFonts w:ascii="Cambria Math" w:eastAsiaTheme="majorEastAsia" w:hAnsi="Cambria Math" w:cstheme="majorBidi"/>
+            </w:rPr>
+            <m:t>μs</m:t>
+          </m:r>
+          <m:r>
+            <w:rPr>
+              <w:rFonts w:ascii="Cambria Math" w:eastAsiaTheme="majorEastAsia" w:hAnsi="Cambria Math" w:cstheme="majorBidi"/>
+            </w:rPr>
+            <m:t>=35.88</m:t>
+          </m:r>
+          <m:r>
+            <w:rPr>
+              <w:rFonts w:ascii="Cambria Math" w:eastAsiaTheme="majorEastAsia" w:hAnsi="Cambria Math" w:cstheme="majorBidi"/>
+            </w:rPr>
+            <m:t>μH</m:t>
           </m:r>
         </m:oMath>
       </m:oMathPara>
@@ -10979,7 +11474,19 @@
                     <w:rPr>
                       <w:rFonts w:ascii="Cambria Math" w:eastAsiaTheme="majorEastAsia" w:hAnsi="Cambria Math" w:cstheme="majorBidi"/>
                     </w:rPr>
-                    <m:t>máx</m:t>
+                    <m:t>m</m:t>
+                  </m:r>
+                  <m:r>
+                    <w:rPr>
+                      <w:rFonts w:ascii="Cambria Math" w:eastAsiaTheme="majorEastAsia" w:hAnsi="Cambria Math" w:cstheme="majorBidi"/>
+                    </w:rPr>
+                    <m:t>á</m:t>
+                  </m:r>
+                  <m:r>
+                    <w:rPr>
+                      <w:rFonts w:ascii="Cambria Math" w:eastAsiaTheme="majorEastAsia" w:hAnsi="Cambria Math" w:cstheme="majorBidi"/>
+                    </w:rPr>
+                    <m:t>x</m:t>
                   </m:r>
                 </m:e>
               </m:d>
@@ -10989,7 +11496,13 @@
             <w:rPr>
               <w:rFonts w:ascii="Cambria Math" w:eastAsiaTheme="majorEastAsia" w:hAnsi="Cambria Math" w:cstheme="majorBidi"/>
             </w:rPr>
-            <m:t>=1A</m:t>
+            <m:t>=1</m:t>
+          </m:r>
+          <m:r>
+            <w:rPr>
+              <w:rFonts w:ascii="Cambria Math" w:eastAsiaTheme="majorEastAsia" w:hAnsi="Cambria Math" w:cstheme="majorBidi"/>
+            </w:rPr>
+            <m:t>A</m:t>
           </m:r>
         </m:oMath>
       </m:oMathPara>
@@ -11315,7 +11828,19 @@
                     <w:rPr>
                       <w:rFonts w:ascii="Cambria Math" w:eastAsiaTheme="majorEastAsia" w:hAnsi="Cambria Math" w:cstheme="majorBidi"/>
                     </w:rPr>
-                    <m:t>máx</m:t>
+                    <m:t>m</m:t>
+                  </m:r>
+                  <m:r>
+                    <w:rPr>
+                      <w:rFonts w:ascii="Cambria Math" w:eastAsiaTheme="majorEastAsia" w:hAnsi="Cambria Math" w:cstheme="majorBidi"/>
+                    </w:rPr>
+                    <m:t>á</m:t>
+                  </m:r>
+                  <m:r>
+                    <w:rPr>
+                      <w:rFonts w:ascii="Cambria Math" w:eastAsiaTheme="majorEastAsia" w:hAnsi="Cambria Math" w:cstheme="majorBidi"/>
+                    </w:rPr>
+                    <m:t>x</m:t>
                   </m:r>
                 </m:e>
               </m:d>
@@ -11442,7 +11967,19 @@
             <w:rPr>
               <w:rFonts w:ascii="Cambria Math" w:eastAsiaTheme="majorEastAsia" w:hAnsi="Cambria Math" w:cstheme="majorBidi"/>
             </w:rPr>
-            <m:t>=1A+</m:t>
+            <m:t>=1</m:t>
+          </m:r>
+          <m:r>
+            <w:rPr>
+              <w:rFonts w:ascii="Cambria Math" w:eastAsiaTheme="majorEastAsia" w:hAnsi="Cambria Math" w:cstheme="majorBidi"/>
+            </w:rPr>
+            <m:t>A</m:t>
+          </m:r>
+          <m:r>
+            <w:rPr>
+              <w:rFonts w:ascii="Cambria Math" w:eastAsiaTheme="majorEastAsia" w:hAnsi="Cambria Math" w:cstheme="majorBidi"/>
+            </w:rPr>
+            <m:t>+</m:t>
           </m:r>
           <m:f>
             <m:fPr>
@@ -11459,7 +11996,13 @@
                 <w:rPr>
                   <w:rFonts w:ascii="Cambria Math" w:eastAsiaTheme="majorEastAsia" w:hAnsi="Cambria Math" w:cstheme="majorBidi"/>
                 </w:rPr>
-                <m:t>1.53A</m:t>
+                <m:t>1.53</m:t>
+              </m:r>
+              <m:r>
+                <w:rPr>
+                  <w:rFonts w:ascii="Cambria Math" w:eastAsiaTheme="majorEastAsia" w:hAnsi="Cambria Math" w:cstheme="majorBidi"/>
+                </w:rPr>
+                <m:t>A</m:t>
               </m:r>
             </m:num>
             <m:den>
@@ -11475,7 +12018,13 @@
             <w:rPr>
               <w:rFonts w:ascii="Cambria Math" w:eastAsiaTheme="majorEastAsia" w:hAnsi="Cambria Math" w:cstheme="majorBidi"/>
             </w:rPr>
-            <m:t>=1.765 A</m:t>
+            <m:t xml:space="preserve">=1.765 </m:t>
+          </m:r>
+          <m:r>
+            <w:rPr>
+              <w:rFonts w:ascii="Cambria Math" w:eastAsiaTheme="majorEastAsia" w:hAnsi="Cambria Math" w:cstheme="majorBidi"/>
+            </w:rPr>
+            <m:t>A</m:t>
           </m:r>
         </m:oMath>
       </m:oMathPara>
@@ -11847,7 +12396,25 @@
                 <w:rPr>
                   <w:rFonts w:ascii="Cambria Math" w:eastAsiaTheme="majorEastAsia" w:hAnsi="Cambria Math" w:cstheme="majorBidi"/>
                 </w:rPr>
-                <m:t>2A×25μs</m:t>
+                <m:t>2</m:t>
+              </m:r>
+              <m:r>
+                <w:rPr>
+                  <w:rFonts w:ascii="Cambria Math" w:eastAsiaTheme="majorEastAsia" w:hAnsi="Cambria Math" w:cstheme="majorBidi"/>
+                </w:rPr>
+                <m:t>A</m:t>
+              </m:r>
+              <m:r>
+                <w:rPr>
+                  <w:rFonts w:ascii="Cambria Math" w:eastAsiaTheme="majorEastAsia" w:hAnsi="Cambria Math" w:cstheme="majorBidi"/>
+                </w:rPr>
+                <m:t>×25</m:t>
+              </m:r>
+              <m:r>
+                <w:rPr>
+                  <w:rFonts w:ascii="Cambria Math" w:eastAsiaTheme="majorEastAsia" w:hAnsi="Cambria Math" w:cstheme="majorBidi"/>
+                </w:rPr>
+                <m:t>μs</m:t>
               </m:r>
             </m:num>
             <m:den>
@@ -11855,7 +12422,13 @@
                 <w:rPr>
                   <w:rFonts w:ascii="Cambria Math" w:eastAsiaTheme="majorEastAsia" w:hAnsi="Cambria Math" w:cstheme="majorBidi"/>
                 </w:rPr>
-                <m:t>8×0.025V</m:t>
+                <m:t>8×0.025</m:t>
+              </m:r>
+              <m:r>
+                <w:rPr>
+                  <w:rFonts w:ascii="Cambria Math" w:eastAsiaTheme="majorEastAsia" w:hAnsi="Cambria Math" w:cstheme="majorBidi"/>
+                </w:rPr>
+                <m:t>V</m:t>
               </m:r>
             </m:den>
           </m:f>
@@ -11863,7 +12436,13 @@
             <w:rPr>
               <w:rFonts w:ascii="Cambria Math" w:eastAsiaTheme="majorEastAsia" w:hAnsi="Cambria Math" w:cstheme="majorBidi"/>
             </w:rPr>
-            <m:t>=250μF</m:t>
+            <m:t>=250</m:t>
+          </m:r>
+          <m:r>
+            <w:rPr>
+              <w:rFonts w:ascii="Cambria Math" w:eastAsiaTheme="majorEastAsia" w:hAnsi="Cambria Math" w:cstheme="majorBidi"/>
+            </w:rPr>
+            <m:t>μF</m:t>
           </m:r>
         </m:oMath>
       </m:oMathPara>
@@ -11908,7 +12487,67 @@
             <w:rPr>
               <w:rFonts w:ascii="Cambria Math" w:eastAsiaTheme="majorEastAsia" w:hAnsi="Cambria Math" w:cstheme="majorBidi"/>
             </w:rPr>
-            <m:t>=220uF+33μF (Valores comreciales seleccionados)</m:t>
+            <m:t>=220</m:t>
+          </m:r>
+          <m:r>
+            <w:rPr>
+              <w:rFonts w:ascii="Cambria Math" w:eastAsiaTheme="majorEastAsia" w:hAnsi="Cambria Math" w:cstheme="majorBidi"/>
+            </w:rPr>
+            <m:t>uF</m:t>
+          </m:r>
+          <m:r>
+            <w:rPr>
+              <w:rFonts w:ascii="Cambria Math" w:eastAsiaTheme="majorEastAsia" w:hAnsi="Cambria Math" w:cstheme="majorBidi"/>
+            </w:rPr>
+            <m:t>+33</m:t>
+          </m:r>
+          <m:r>
+            <w:rPr>
+              <w:rFonts w:ascii="Cambria Math" w:eastAsiaTheme="majorEastAsia" w:hAnsi="Cambria Math" w:cstheme="majorBidi"/>
+            </w:rPr>
+            <m:t>μF</m:t>
+          </m:r>
+          <m:r>
+            <w:rPr>
+              <w:rFonts w:ascii="Cambria Math" w:eastAsiaTheme="majorEastAsia" w:hAnsi="Cambria Math" w:cstheme="majorBidi"/>
+            </w:rPr>
+            <m:t xml:space="preserve"> (</m:t>
+          </m:r>
+          <m:r>
+            <w:rPr>
+              <w:rFonts w:ascii="Cambria Math" w:eastAsiaTheme="majorEastAsia" w:hAnsi="Cambria Math" w:cstheme="majorBidi"/>
+            </w:rPr>
+            <m:t>Valores</m:t>
+          </m:r>
+          <m:r>
+            <w:rPr>
+              <w:rFonts w:ascii="Cambria Math" w:eastAsiaTheme="majorEastAsia" w:hAnsi="Cambria Math" w:cstheme="majorBidi"/>
+            </w:rPr>
+            <m:t xml:space="preserve"> </m:t>
+          </m:r>
+          <m:r>
+            <w:rPr>
+              <w:rFonts w:ascii="Cambria Math" w:eastAsiaTheme="majorEastAsia" w:hAnsi="Cambria Math" w:cstheme="majorBidi"/>
+            </w:rPr>
+            <m:t>comreciales</m:t>
+          </m:r>
+          <m:r>
+            <w:rPr>
+              <w:rFonts w:ascii="Cambria Math" w:eastAsiaTheme="majorEastAsia" w:hAnsi="Cambria Math" w:cstheme="majorBidi"/>
+            </w:rPr>
+            <m:t xml:space="preserve"> </m:t>
+          </m:r>
+          <m:r>
+            <w:rPr>
+              <w:rFonts w:ascii="Cambria Math" w:eastAsiaTheme="majorEastAsia" w:hAnsi="Cambria Math" w:cstheme="majorBidi"/>
+            </w:rPr>
+            <m:t>seleccionados</m:t>
+          </m:r>
+          <m:r>
+            <w:rPr>
+              <w:rFonts w:ascii="Cambria Math" w:eastAsiaTheme="majorEastAsia" w:hAnsi="Cambria Math" w:cstheme="majorBidi"/>
+            </w:rPr>
+            <m:t>)</m:t>
           </m:r>
         </m:oMath>
       </m:oMathPara>
@@ -12157,7 +12796,13 @@
             <w:rPr>
               <w:rFonts w:ascii="Cambria Math" w:eastAsiaTheme="majorEastAsia" w:hAnsi="Cambria Math" w:cstheme="majorBidi"/>
             </w:rPr>
-            <m:t>=5V</m:t>
+            <m:t>=5</m:t>
+          </m:r>
+          <m:r>
+            <w:rPr>
+              <w:rFonts w:ascii="Cambria Math" w:eastAsiaTheme="majorEastAsia" w:hAnsi="Cambria Math" w:cstheme="majorBidi"/>
+            </w:rPr>
+            <m:t>V</m:t>
           </m:r>
         </m:oMath>
       </m:oMathPara>
@@ -12337,7 +12982,13 @@
             <w:rPr>
               <w:rFonts w:ascii="Cambria Math" w:eastAsiaTheme="majorEastAsia" w:hAnsi="Cambria Math" w:cstheme="majorBidi"/>
             </w:rPr>
-            <m:t>-1=</m:t>
+            <m:t>-</m:t>
+          </m:r>
+          <m:r>
+            <w:rPr>
+              <w:rFonts w:ascii="Cambria Math" w:eastAsiaTheme="majorEastAsia" w:hAnsi="Cambria Math" w:cstheme="majorBidi"/>
+            </w:rPr>
+            <m:t>1=</m:t>
           </m:r>
           <m:f>
             <m:fPr>
@@ -12354,7 +13005,13 @@
                 <w:rPr>
                   <w:rFonts w:ascii="Cambria Math" w:eastAsiaTheme="majorEastAsia" w:hAnsi="Cambria Math" w:cstheme="majorBidi"/>
                 </w:rPr>
-                <m:t>5V</m:t>
+                <m:t>5</m:t>
+              </m:r>
+              <m:r>
+                <w:rPr>
+                  <w:rFonts w:ascii="Cambria Math" w:eastAsiaTheme="majorEastAsia" w:hAnsi="Cambria Math" w:cstheme="majorBidi"/>
+                </w:rPr>
+                <m:t>V</m:t>
               </m:r>
             </m:num>
             <m:den>
@@ -12362,7 +13019,13 @@
                 <w:rPr>
                   <w:rFonts w:ascii="Cambria Math" w:eastAsiaTheme="majorEastAsia" w:hAnsi="Cambria Math" w:cstheme="majorBidi"/>
                 </w:rPr>
-                <m:t>1.25V</m:t>
+                <m:t>1.25</m:t>
+              </m:r>
+              <m:r>
+                <w:rPr>
+                  <w:rFonts w:ascii="Cambria Math" w:eastAsiaTheme="majorEastAsia" w:hAnsi="Cambria Math" w:cstheme="majorBidi"/>
+                </w:rPr>
+                <m:t>V</m:t>
               </m:r>
             </m:den>
           </m:f>
@@ -12370,7 +13033,13 @@
             <w:rPr>
               <w:rFonts w:ascii="Cambria Math" w:eastAsiaTheme="majorEastAsia" w:hAnsi="Cambria Math" w:cstheme="majorBidi"/>
             </w:rPr>
-            <m:t>-1=3</m:t>
+            <m:t>-</m:t>
+          </m:r>
+          <m:r>
+            <w:rPr>
+              <w:rFonts w:ascii="Cambria Math" w:eastAsiaTheme="majorEastAsia" w:hAnsi="Cambria Math" w:cstheme="majorBidi"/>
+            </w:rPr>
+            <m:t>1=3</m:t>
           </m:r>
         </m:oMath>
       </m:oMathPara>
@@ -12433,7 +13102,13 @@
             <w:rPr>
               <w:rFonts w:ascii="Cambria Math" w:eastAsiaTheme="majorEastAsia" w:hAnsi="Cambria Math" w:cstheme="majorBidi"/>
             </w:rPr>
-            <m:t>=11K</m:t>
+            <m:t>=11</m:t>
+          </m:r>
+          <m:r>
+            <w:rPr>
+              <w:rFonts w:ascii="Cambria Math" w:eastAsiaTheme="majorEastAsia" w:hAnsi="Cambria Math" w:cstheme="majorBidi"/>
+            </w:rPr>
+            <m:t>K</m:t>
           </m:r>
           <m:r>
             <m:rPr>
@@ -12481,7 +13156,13 @@
             <w:rPr>
               <w:rFonts w:ascii="Cambria Math" w:eastAsiaTheme="majorEastAsia" w:hAnsi="Cambria Math" w:cstheme="majorBidi"/>
             </w:rPr>
-            <m:t>=33K</m:t>
+            <m:t>=33</m:t>
+          </m:r>
+          <m:r>
+            <w:rPr>
+              <w:rFonts w:ascii="Cambria Math" w:eastAsiaTheme="majorEastAsia" w:hAnsi="Cambria Math" w:cstheme="majorBidi"/>
+            </w:rPr>
+            <m:t>K</m:t>
           </m:r>
           <m:r>
             <m:rPr>
@@ -14309,7 +14990,13 @@
         <w:t>:</w:t>
       </w:r>
       <w:r>
-        <w:t xml:space="preserve"> Esquemático realizada en </w:t>
+        <w:t xml:space="preserve"> Esquemático realizad</w:t>
+      </w:r>
+      <w:r>
+        <w:t>o</w:t>
+      </w:r>
+      <w:r>
+        <w:t xml:space="preserve"> en </w:t>
       </w:r>
       <w:r>
         <w:t>K</w:t>
@@ -14416,7 +15103,13 @@
         <w:t>:</w:t>
       </w:r>
       <w:r>
-        <w:t xml:space="preserve"> PCB realizada en KiCad</w:t>
+        <w:t xml:space="preserve"> PCB realizad</w:t>
+      </w:r>
+      <w:r>
+        <w:t>o</w:t>
+      </w:r>
+      <w:r>
+        <w:t xml:space="preserve"> en KiCad</w:t>
       </w:r>
     </w:p>
     <w:p>

</xml_diff>

<commit_message>
Informe completado con éxito
</commit_message>
<xml_diff>
--- a/Proyecto 1C/Informe.docx
+++ b/Proyecto 1C/Informe.docx
@@ -3664,11 +3664,29 @@
         <w:t>impulsaron</w:t>
       </w:r>
       <w:r>
-        <w:t xml:space="preserve"> el uso generalizado de las fuentes de alimentación conmutadas (Switch Mode </w:t>
-      </w:r>
-      <w:r>
-        <w:t>Power Supplies</w:t>
-      </w:r>
+        <w:t xml:space="preserve"> el uso generalizado de las fuentes de alimentación conmutadas (Switch </w:t>
+      </w:r>
+      <w:proofErr w:type="spellStart"/>
+      <w:r>
+        <w:t>Mode</w:t>
+      </w:r>
+      <w:proofErr w:type="spellEnd"/>
+      <w:r>
+        <w:t xml:space="preserve"> </w:t>
+      </w:r>
+      <w:proofErr w:type="spellStart"/>
+      <w:r>
+        <w:t>Power</w:t>
+      </w:r>
+      <w:proofErr w:type="spellEnd"/>
+      <w:r>
+        <w:t xml:space="preserve"> </w:t>
+      </w:r>
+      <w:proofErr w:type="spellStart"/>
+      <w:r>
+        <w:t>Supplies</w:t>
+      </w:r>
+      <w:proofErr w:type="spellEnd"/>
       <w:r>
         <w:t xml:space="preserve">) </w:t>
       </w:r>
@@ -3760,8 +3778,13 @@
       <w:r>
         <w:t xml:space="preserve">como los convertidores </w:t>
       </w:r>
-      <w:r>
-        <w:t xml:space="preserve">Flyback </w:t>
+      <w:proofErr w:type="spellStart"/>
+      <w:r>
+        <w:t>Flyback</w:t>
+      </w:r>
+      <w:proofErr w:type="spellEnd"/>
+      <w:r>
+        <w:t xml:space="preserve"> </w:t>
       </w:r>
       <w:r>
         <w:t xml:space="preserve">y </w:t>
@@ -4461,23 +4484,7 @@
               <w:sz w:val="32"/>
               <w:szCs w:val="32"/>
             </w:rPr>
-            <m:t>=</m:t>
-          </m:r>
-          <m:r>
-            <w:rPr>
-              <w:rFonts w:ascii="Cambria Math" w:hAnsi="Cambria Math"/>
-              <w:sz w:val="32"/>
-              <w:szCs w:val="32"/>
-            </w:rPr>
-            <m:t>D</m:t>
-          </m:r>
-          <m:r>
-            <w:rPr>
-              <w:rFonts w:ascii="Cambria Math" w:hAnsi="Cambria Math"/>
-              <w:sz w:val="32"/>
-              <w:szCs w:val="32"/>
-            </w:rPr>
-            <m:t>∙</m:t>
+            <m:t>=D∙</m:t>
           </m:r>
           <m:sSub>
             <m:sSubPr>
@@ -6892,23 +6899,7 @@
                     <w:sz w:val="24"/>
                     <w:szCs w:val="24"/>
                   </w:rPr>
-                  <m:t>=</m:t>
-                </m:r>
-                <m:r>
-                  <w:rPr>
-                    <w:rFonts w:ascii="Cambria Math" w:hAnsi="Cambria Math"/>
-                    <w:sz w:val="24"/>
-                    <w:szCs w:val="24"/>
-                  </w:rPr>
-                  <m:t>T</m:t>
-                </m:r>
-                <m:r>
-                  <w:rPr>
-                    <w:rFonts w:ascii="Cambria Math" w:hAnsi="Cambria Math"/>
-                    <w:sz w:val="24"/>
-                    <w:szCs w:val="24"/>
-                  </w:rPr>
-                  <m:t>-</m:t>
+                  <m:t>=T-</m:t>
                 </m:r>
                 <m:sSub>
                   <m:sSubPr>
@@ -7054,15 +7045,7 @@
                         <w:sz w:val="24"/>
                         <w:szCs w:val="24"/>
                       </w:rPr>
-                      <m:t>-</m:t>
-                    </m:r>
-                    <m:r>
-                      <w:rPr>
-                        <w:rFonts w:ascii="Cambria Math" w:hAnsi="Cambria Math"/>
-                        <w:sz w:val="24"/>
-                        <w:szCs w:val="24"/>
-                      </w:rPr>
-                      <m:t>5</m:t>
+                      <m:t>-5</m:t>
                     </m:r>
                   </m:sup>
                 </m:sSup>
@@ -7201,15 +7184,7 @@
                             <w:sz w:val="24"/>
                             <w:szCs w:val="24"/>
                           </w:rPr>
-                          <m:t>switc</m:t>
-                        </m:r>
-                        <m:r>
-                          <w:rPr>
-                            <w:rFonts w:ascii="Cambria Math" w:hAnsi="Cambria Math"/>
-                            <w:sz w:val="24"/>
-                            <w:szCs w:val="24"/>
-                          </w:rPr>
-                          <m:t>h</m:t>
+                          <m:t>switch</m:t>
                         </m:r>
                       </m:e>
                     </m:d>
@@ -7271,23 +7246,7 @@
                             <w:sz w:val="24"/>
                             <w:szCs w:val="24"/>
                           </w:rPr>
-                          <m:t>m</m:t>
-                        </m:r>
-                        <m:r>
-                          <w:rPr>
-                            <w:rFonts w:ascii="Cambria Math" w:hAnsi="Cambria Math"/>
-                            <w:sz w:val="24"/>
-                            <w:szCs w:val="24"/>
-                          </w:rPr>
-                          <m:t>á</m:t>
-                        </m:r>
-                        <m:r>
-                          <w:rPr>
-                            <w:rFonts w:ascii="Cambria Math" w:hAnsi="Cambria Math"/>
-                            <w:sz w:val="24"/>
-                            <w:szCs w:val="24"/>
-                          </w:rPr>
-                          <m:t>x</m:t>
+                          <m:t>máx</m:t>
                         </m:r>
                       </m:e>
                     </m:d>
@@ -7447,15 +7406,7 @@
                                 <w:sz w:val="24"/>
                                 <w:szCs w:val="24"/>
                               </w:rPr>
-                              <m:t>switc</m:t>
-                            </m:r>
-                            <m:r>
-                              <w:rPr>
-                                <w:rFonts w:ascii="Cambria Math" w:hAnsi="Cambria Math"/>
-                                <w:sz w:val="24"/>
-                                <w:szCs w:val="24"/>
-                              </w:rPr>
-                              <m:t>h</m:t>
+                              <m:t>switch</m:t>
                             </m:r>
                           </m:e>
                         </m:d>
@@ -7537,23 +7488,7 @@
                         <w:sz w:val="24"/>
                         <w:szCs w:val="24"/>
                       </w:rPr>
-                      <m:t>m</m:t>
-                    </m:r>
-                    <m:r>
-                      <w:rPr>
-                        <w:rFonts w:ascii="Cambria Math" w:hAnsi="Cambria Math"/>
-                        <w:sz w:val="24"/>
-                        <w:szCs w:val="24"/>
-                      </w:rPr>
-                      <m:t>í</m:t>
-                    </m:r>
-                    <m:r>
-                      <w:rPr>
-                        <w:rFonts w:ascii="Cambria Math" w:hAnsi="Cambria Math"/>
-                        <w:sz w:val="24"/>
-                        <w:szCs w:val="24"/>
-                      </w:rPr>
-                      <m:t>n</m:t>
+                      <m:t>mín</m:t>
                     </m:r>
                   </m:sub>
                 </m:sSub>
@@ -7751,15 +7686,7 @@
                                     <w:sz w:val="24"/>
                                     <w:szCs w:val="24"/>
                                   </w:rPr>
-                                  <m:t>switc</m:t>
-                                </m:r>
-                                <m:r>
-                                  <w:rPr>
-                                    <w:rFonts w:ascii="Cambria Math" w:hAnsi="Cambria Math"/>
-                                    <w:sz w:val="24"/>
-                                    <w:szCs w:val="24"/>
-                                  </w:rPr>
-                                  <m:t>h</m:t>
+                                  <m:t>switch</m:t>
                                 </m:r>
                               </m:e>
                             </m:d>
@@ -7953,15 +7880,7 @@
                                 <w:sz w:val="24"/>
                                 <w:szCs w:val="24"/>
                               </w:rPr>
-                              <m:t>switc</m:t>
-                            </m:r>
-                            <m:r>
-                              <w:rPr>
-                                <w:rFonts w:ascii="Cambria Math" w:hAnsi="Cambria Math"/>
-                                <w:sz w:val="24"/>
-                                <w:szCs w:val="24"/>
-                              </w:rPr>
-                              <m:t>h</m:t>
+                              <m:t>switch</m:t>
                             </m:r>
                           </m:e>
                         </m:d>
@@ -8743,25 +8662,7 @@
                 <w:rPr>
                   <w:rFonts w:ascii="Cambria Math" w:eastAsiaTheme="majorEastAsia" w:hAnsi="Cambria Math" w:cstheme="majorBidi"/>
                 </w:rPr>
-                <m:t>5</m:t>
-              </m:r>
-              <m:r>
-                <w:rPr>
-                  <w:rFonts w:ascii="Cambria Math" w:eastAsiaTheme="majorEastAsia" w:hAnsi="Cambria Math" w:cstheme="majorBidi"/>
-                </w:rPr>
-                <m:t>V</m:t>
-              </m:r>
-              <m:r>
-                <w:rPr>
-                  <w:rFonts w:ascii="Cambria Math" w:eastAsiaTheme="majorEastAsia" w:hAnsi="Cambria Math" w:cstheme="majorBidi"/>
-                </w:rPr>
-                <m:t>+0.5</m:t>
-              </m:r>
-              <m:r>
-                <w:rPr>
-                  <w:rFonts w:ascii="Cambria Math" w:eastAsiaTheme="majorEastAsia" w:hAnsi="Cambria Math" w:cstheme="majorBidi"/>
-                </w:rPr>
-                <m:t>V</m:t>
+                <m:t>5V+0.5V</m:t>
               </m:r>
             </m:num>
             <m:den>
@@ -8769,49 +8670,7 @@
                 <w:rPr>
                   <w:rFonts w:ascii="Cambria Math" w:eastAsiaTheme="majorEastAsia" w:hAnsi="Cambria Math" w:cstheme="majorBidi"/>
                 </w:rPr>
-                <m:t>12</m:t>
-              </m:r>
-              <m:r>
-                <w:rPr>
-                  <w:rFonts w:ascii="Cambria Math" w:eastAsiaTheme="majorEastAsia" w:hAnsi="Cambria Math" w:cstheme="majorBidi"/>
-                </w:rPr>
-                <m:t>V</m:t>
-              </m:r>
-              <m:r>
-                <w:rPr>
-                  <w:rFonts w:ascii="Cambria Math" w:eastAsiaTheme="majorEastAsia" w:hAnsi="Cambria Math" w:cstheme="majorBidi"/>
-                </w:rPr>
-                <m:t>-</m:t>
-              </m:r>
-              <m:r>
-                <w:rPr>
-                  <w:rFonts w:ascii="Cambria Math" w:eastAsiaTheme="majorEastAsia" w:hAnsi="Cambria Math" w:cstheme="majorBidi"/>
-                </w:rPr>
-                <m:t>1</m:t>
-              </m:r>
-              <m:r>
-                <w:rPr>
-                  <w:rFonts w:ascii="Cambria Math" w:eastAsiaTheme="majorEastAsia" w:hAnsi="Cambria Math" w:cstheme="majorBidi"/>
-                </w:rPr>
-                <m:t>V</m:t>
-              </m:r>
-              <m:r>
-                <w:rPr>
-                  <w:rFonts w:ascii="Cambria Math" w:eastAsiaTheme="majorEastAsia" w:hAnsi="Cambria Math" w:cstheme="majorBidi"/>
-                </w:rPr>
-                <m:t>-</m:t>
-              </m:r>
-              <m:r>
-                <w:rPr>
-                  <w:rFonts w:ascii="Cambria Math" w:eastAsiaTheme="majorEastAsia" w:hAnsi="Cambria Math" w:cstheme="majorBidi"/>
-                </w:rPr>
-                <m:t>5</m:t>
-              </m:r>
-              <m:r>
-                <w:rPr>
-                  <w:rFonts w:ascii="Cambria Math" w:eastAsiaTheme="majorEastAsia" w:hAnsi="Cambria Math" w:cstheme="majorBidi"/>
-                </w:rPr>
-                <m:t>V</m:t>
+                <m:t>12V-1V-5V</m:t>
               </m:r>
             </m:den>
           </m:f>
@@ -9069,13 +8928,7 @@
                 <w:rPr>
                   <w:rFonts w:ascii="Cambria Math" w:eastAsiaTheme="majorEastAsia" w:hAnsi="Cambria Math" w:cstheme="majorBidi"/>
                 </w:rPr>
-                <m:t>25</m:t>
-              </m:r>
-              <m:r>
-                <w:rPr>
-                  <w:rFonts w:ascii="Cambria Math" w:eastAsiaTheme="majorEastAsia" w:hAnsi="Cambria Math" w:cstheme="majorBidi"/>
-                </w:rPr>
-                <m:t>μs</m:t>
+                <m:t>25μs</m:t>
               </m:r>
             </m:num>
             <m:den>
@@ -9091,13 +8944,7 @@
             <w:rPr>
               <w:rFonts w:ascii="Cambria Math" w:eastAsiaTheme="majorEastAsia" w:hAnsi="Cambria Math" w:cstheme="majorBidi"/>
             </w:rPr>
-            <m:t>=13.04</m:t>
-          </m:r>
-          <m:r>
-            <w:rPr>
-              <w:rFonts w:ascii="Cambria Math" w:eastAsiaTheme="majorEastAsia" w:hAnsi="Cambria Math" w:cstheme="majorBidi"/>
-            </w:rPr>
-            <m:t>μs</m:t>
+            <m:t>=13.04μs</m:t>
           </m:r>
         </m:oMath>
       </m:oMathPara>
@@ -9140,19 +8987,7 @@
             <w:rPr>
               <w:rFonts w:ascii="Cambria Math" w:eastAsiaTheme="majorEastAsia" w:hAnsi="Cambria Math" w:cstheme="majorBidi"/>
             </w:rPr>
-            <m:t>=</m:t>
-          </m:r>
-          <m:r>
-            <w:rPr>
-              <w:rFonts w:ascii="Cambria Math" w:eastAsiaTheme="majorEastAsia" w:hAnsi="Cambria Math" w:cstheme="majorBidi"/>
-            </w:rPr>
-            <m:t>T</m:t>
-          </m:r>
-          <m:r>
-            <w:rPr>
-              <w:rFonts w:ascii="Cambria Math" w:eastAsiaTheme="majorEastAsia" w:hAnsi="Cambria Math" w:cstheme="majorBidi"/>
-            </w:rPr>
-            <m:t>-</m:t>
+            <m:t>=T-</m:t>
           </m:r>
           <m:sSub>
             <m:sSubPr>
@@ -9184,43 +9019,7 @@
             <w:rPr>
               <w:rFonts w:ascii="Cambria Math" w:eastAsiaTheme="majorEastAsia" w:hAnsi="Cambria Math" w:cstheme="majorBidi"/>
             </w:rPr>
-            <m:t>=25</m:t>
-          </m:r>
-          <m:r>
-            <w:rPr>
-              <w:rFonts w:ascii="Cambria Math" w:eastAsiaTheme="majorEastAsia" w:hAnsi="Cambria Math" w:cstheme="majorBidi"/>
-            </w:rPr>
-            <m:t>μs</m:t>
-          </m:r>
-          <m:r>
-            <w:rPr>
-              <w:rFonts w:ascii="Cambria Math" w:eastAsiaTheme="majorEastAsia" w:hAnsi="Cambria Math" w:cstheme="majorBidi"/>
-            </w:rPr>
-            <m:t>-</m:t>
-          </m:r>
-          <m:r>
-            <w:rPr>
-              <w:rFonts w:ascii="Cambria Math" w:eastAsiaTheme="majorEastAsia" w:hAnsi="Cambria Math" w:cstheme="majorBidi"/>
-            </w:rPr>
-            <m:t>13.04</m:t>
-          </m:r>
-          <m:r>
-            <w:rPr>
-              <w:rFonts w:ascii="Cambria Math" w:eastAsiaTheme="majorEastAsia" w:hAnsi="Cambria Math" w:cstheme="majorBidi"/>
-            </w:rPr>
-            <m:t>μs</m:t>
-          </m:r>
-          <m:r>
-            <w:rPr>
-              <w:rFonts w:ascii="Cambria Math" w:eastAsiaTheme="majorEastAsia" w:hAnsi="Cambria Math" w:cstheme="majorBidi"/>
-            </w:rPr>
-            <m:t>= 11.96</m:t>
-          </m:r>
-          <m:r>
-            <w:rPr>
-              <w:rFonts w:ascii="Cambria Math" w:eastAsiaTheme="majorEastAsia" w:hAnsi="Cambria Math" w:cstheme="majorBidi"/>
-            </w:rPr>
-            <m:t>μs</m:t>
+            <m:t>=25μs-13.04μs= 11.96μs</m:t>
           </m:r>
         </m:oMath>
       </m:oMathPara>
@@ -9363,13 +9162,7 @@
                 <w:rPr>
                   <w:rFonts w:ascii="Cambria Math" w:eastAsiaTheme="majorEastAsia" w:hAnsi="Cambria Math" w:cstheme="majorBidi"/>
                 </w:rPr>
-                <m:t>-</m:t>
-              </m:r>
-              <m:r>
-                <w:rPr>
-                  <w:rFonts w:ascii="Cambria Math" w:eastAsiaTheme="majorEastAsia" w:hAnsi="Cambria Math" w:cstheme="majorBidi"/>
-                </w:rPr>
-                <m:t>5</m:t>
+                <m:t>-5</m:t>
               </m:r>
             </m:sup>
           </m:sSup>
@@ -9435,13 +9228,7 @@
                 <w:rPr>
                   <w:rFonts w:ascii="Cambria Math" w:eastAsiaTheme="majorEastAsia" w:hAnsi="Cambria Math" w:cstheme="majorBidi"/>
                 </w:rPr>
-                <m:t>-</m:t>
-              </m:r>
-              <m:r>
-                <w:rPr>
-                  <w:rFonts w:ascii="Cambria Math" w:eastAsiaTheme="majorEastAsia" w:hAnsi="Cambria Math" w:cstheme="majorBidi"/>
-                </w:rPr>
-                <m:t>5</m:t>
+                <m:t>-5</m:t>
               </m:r>
             </m:sup>
           </m:sSup>
@@ -9449,25 +9236,7 @@
             <w:rPr>
               <w:rFonts w:ascii="Cambria Math" w:eastAsiaTheme="majorEastAsia" w:hAnsi="Cambria Math" w:cstheme="majorBidi"/>
             </w:rPr>
-            <m:t>∙</m:t>
-          </m:r>
-          <m:r>
-            <w:rPr>
-              <w:rFonts w:ascii="Cambria Math" w:eastAsiaTheme="majorEastAsia" w:hAnsi="Cambria Math" w:cstheme="majorBidi"/>
-            </w:rPr>
-            <m:t xml:space="preserve"> 11.96</m:t>
-          </m:r>
-          <m:r>
-            <w:rPr>
-              <w:rFonts w:ascii="Cambria Math" w:eastAsiaTheme="majorEastAsia" w:hAnsi="Cambria Math" w:cstheme="majorBidi"/>
-            </w:rPr>
-            <m:t>μs</m:t>
-          </m:r>
-          <m:r>
-            <w:rPr>
-              <w:rFonts w:ascii="Cambria Math" w:eastAsiaTheme="majorEastAsia" w:hAnsi="Cambria Math" w:cstheme="majorBidi"/>
-            </w:rPr>
-            <m:t>=47.84×</m:t>
+            <m:t>∙ 11.96μs=47.84×</m:t>
           </m:r>
           <m:sSup>
             <m:sSupPr>
@@ -9492,13 +9261,7 @@
                 <w:rPr>
                   <w:rFonts w:ascii="Cambria Math" w:eastAsiaTheme="majorEastAsia" w:hAnsi="Cambria Math" w:cstheme="majorBidi"/>
                 </w:rPr>
-                <m:t>-</m:t>
-              </m:r>
-              <m:r>
-                <w:rPr>
-                  <w:rFonts w:ascii="Cambria Math" w:eastAsiaTheme="majorEastAsia" w:hAnsi="Cambria Math" w:cstheme="majorBidi"/>
-                </w:rPr>
-                <m:t>11</m:t>
+                <m:t>-11</m:t>
               </m:r>
             </m:sup>
           </m:sSup>
@@ -9551,19 +9314,7 @@
             <w:rPr>
               <w:rFonts w:ascii="Cambria Math" w:eastAsiaTheme="majorEastAsia" w:hAnsi="Cambria Math" w:cstheme="majorBidi"/>
             </w:rPr>
-            <m:t xml:space="preserve">=478.4 </m:t>
-          </m:r>
-          <m:r>
-            <w:rPr>
-              <w:rFonts w:ascii="Cambria Math" w:eastAsiaTheme="majorEastAsia" w:hAnsi="Cambria Math" w:cstheme="majorBidi"/>
-            </w:rPr>
-            <m:t>pF</m:t>
-          </m:r>
-          <m:r>
-            <w:rPr>
-              <w:rFonts w:ascii="Cambria Math" w:eastAsiaTheme="majorEastAsia" w:hAnsi="Cambria Math" w:cstheme="majorBidi"/>
-            </w:rPr>
-            <m:t xml:space="preserve"> </m:t>
+            <m:t xml:space="preserve">=478.4 pF </m:t>
           </m:r>
           <m:d>
             <m:dPr>
@@ -9580,19 +9331,7 @@
                 <w:rPr>
                   <w:rFonts w:ascii="Cambria Math" w:eastAsiaTheme="majorEastAsia" w:hAnsi="Cambria Math" w:cstheme="majorBidi"/>
                 </w:rPr>
-                <m:t>Valor</m:t>
-              </m:r>
-              <m:r>
-                <w:rPr>
-                  <w:rFonts w:ascii="Cambria Math" w:eastAsiaTheme="majorEastAsia" w:hAnsi="Cambria Math" w:cstheme="majorBidi"/>
-                </w:rPr>
-                <m:t xml:space="preserve"> </m:t>
-              </m:r>
-              <m:r>
-                <w:rPr>
-                  <w:rFonts w:ascii="Cambria Math" w:eastAsiaTheme="majorEastAsia" w:hAnsi="Cambria Math" w:cstheme="majorBidi"/>
-                </w:rPr>
-                <m:t>exacto</m:t>
+                <m:t>Valor exacto</m:t>
               </m:r>
             </m:e>
           </m:d>
@@ -9660,43 +9399,7 @@
             <w:rPr>
               <w:rFonts w:ascii="Cambria Math" w:eastAsiaTheme="majorEastAsia" w:hAnsi="Cambria Math" w:cstheme="majorBidi"/>
             </w:rPr>
-            <m:t xml:space="preserve">≈470 </m:t>
-          </m:r>
-          <m:r>
-            <w:rPr>
-              <w:rFonts w:ascii="Cambria Math" w:eastAsiaTheme="majorEastAsia" w:hAnsi="Cambria Math" w:cstheme="majorBidi"/>
-            </w:rPr>
-            <m:t>pF</m:t>
-          </m:r>
-          <m:r>
-            <w:rPr>
-              <w:rFonts w:ascii="Cambria Math" w:eastAsiaTheme="majorEastAsia" w:hAnsi="Cambria Math" w:cstheme="majorBidi"/>
-            </w:rPr>
-            <m:t xml:space="preserve"> (</m:t>
-          </m:r>
-          <m:r>
-            <w:rPr>
-              <w:rFonts w:ascii="Cambria Math" w:eastAsiaTheme="majorEastAsia" w:hAnsi="Cambria Math" w:cstheme="majorBidi"/>
-            </w:rPr>
-            <m:t>Valor</m:t>
-          </m:r>
-          <m:r>
-            <w:rPr>
-              <w:rFonts w:ascii="Cambria Math" w:eastAsiaTheme="majorEastAsia" w:hAnsi="Cambria Math" w:cstheme="majorBidi"/>
-            </w:rPr>
-            <m:t xml:space="preserve"> </m:t>
-          </m:r>
-          <m:r>
-            <w:rPr>
-              <w:rFonts w:ascii="Cambria Math" w:eastAsiaTheme="majorEastAsia" w:hAnsi="Cambria Math" w:cstheme="majorBidi"/>
-            </w:rPr>
-            <m:t>comercial</m:t>
-          </m:r>
-          <m:r>
-            <w:rPr>
-              <w:rFonts w:ascii="Cambria Math" w:eastAsiaTheme="majorEastAsia" w:hAnsi="Cambria Math" w:cstheme="majorBidi"/>
-            </w:rPr>
-            <m:t>)</m:t>
+            <m:t>≈470 pF (Valor comercial)</m:t>
           </m:r>
         </m:oMath>
       </m:oMathPara>
@@ -9882,13 +9585,7 @@
                     <w:rPr>
                       <w:rFonts w:ascii="Cambria Math" w:eastAsiaTheme="majorEastAsia" w:hAnsi="Cambria Math" w:cstheme="majorBidi"/>
                     </w:rPr>
-                    <m:t>-</m:t>
-                  </m:r>
-                  <m:r>
-                    <w:rPr>
-                      <w:rFonts w:ascii="Cambria Math" w:eastAsiaTheme="majorEastAsia" w:hAnsi="Cambria Math" w:cstheme="majorBidi"/>
-                    </w:rPr>
-                    <m:t>5</m:t>
+                    <m:t>-5</m:t>
                   </m:r>
                 </m:sup>
               </m:sSup>
@@ -9940,13 +9637,7 @@
                     <w:rPr>
                       <w:rFonts w:ascii="Cambria Math" w:eastAsiaTheme="majorEastAsia" w:hAnsi="Cambria Math" w:cstheme="majorBidi"/>
                     </w:rPr>
-                    <m:t>-</m:t>
-                  </m:r>
-                  <m:r>
-                    <w:rPr>
-                      <w:rFonts w:ascii="Cambria Math" w:eastAsiaTheme="majorEastAsia" w:hAnsi="Cambria Math" w:cstheme="majorBidi"/>
-                    </w:rPr>
-                    <m:t>12</m:t>
+                    <m:t>-12</m:t>
                   </m:r>
                 </m:sup>
               </m:sSup>
@@ -9987,13 +9678,7 @@
                     <w:rPr>
                       <w:rFonts w:ascii="Cambria Math" w:eastAsiaTheme="majorEastAsia" w:hAnsi="Cambria Math" w:cstheme="majorBidi"/>
                     </w:rPr>
-                    <m:t>-</m:t>
-                  </m:r>
-                  <m:r>
-                    <w:rPr>
-                      <w:rFonts w:ascii="Cambria Math" w:eastAsiaTheme="majorEastAsia" w:hAnsi="Cambria Math" w:cstheme="majorBidi"/>
-                    </w:rPr>
-                    <m:t>5</m:t>
+                    <m:t>-5</m:t>
                   </m:r>
                 </m:sup>
               </m:sSup>
@@ -10003,13 +9688,7 @@
             <w:rPr>
               <w:rFonts w:ascii="Cambria Math" w:eastAsiaTheme="majorEastAsia" w:hAnsi="Cambria Math" w:cstheme="majorBidi"/>
             </w:rPr>
-            <m:t>=11.75</m:t>
-          </m:r>
-          <m:r>
-            <w:rPr>
-              <w:rFonts w:ascii="Cambria Math" w:eastAsiaTheme="majorEastAsia" w:hAnsi="Cambria Math" w:cstheme="majorBidi"/>
-            </w:rPr>
-            <m:t>μs</m:t>
+            <m:t>=11.75μs</m:t>
           </m:r>
         </m:oMath>
       </m:oMathPara>
@@ -10248,19 +9927,7 @@
                     <w:rPr>
                       <w:rFonts w:ascii="Cambria Math" w:eastAsiaTheme="majorEastAsia" w:hAnsi="Cambria Math" w:cstheme="majorBidi"/>
                     </w:rPr>
-                    <m:t>m</m:t>
-                  </m:r>
-                  <m:r>
-                    <w:rPr>
-                      <w:rFonts w:ascii="Cambria Math" w:eastAsiaTheme="majorEastAsia" w:hAnsi="Cambria Math" w:cstheme="majorBidi"/>
-                    </w:rPr>
-                    <m:t>á</m:t>
-                  </m:r>
-                  <m:r>
-                    <w:rPr>
-                      <w:rFonts w:ascii="Cambria Math" w:eastAsiaTheme="majorEastAsia" w:hAnsi="Cambria Math" w:cstheme="majorBidi"/>
-                    </w:rPr>
-                    <m:t>x</m:t>
+                    <m:t>máx</m:t>
                   </m:r>
                 </m:e>
               </m:d>
@@ -10270,25 +9937,7 @@
             <w:rPr>
               <w:rFonts w:ascii="Cambria Math" w:eastAsiaTheme="majorEastAsia" w:hAnsi="Cambria Math" w:cstheme="majorBidi"/>
             </w:rPr>
-            <m:t>=2×1</m:t>
-          </m:r>
-          <m:r>
-            <w:rPr>
-              <w:rFonts w:ascii="Cambria Math" w:eastAsiaTheme="majorEastAsia" w:hAnsi="Cambria Math" w:cstheme="majorBidi"/>
-            </w:rPr>
-            <m:t>A</m:t>
-          </m:r>
-          <m:r>
-            <w:rPr>
-              <w:rFonts w:ascii="Cambria Math" w:eastAsiaTheme="majorEastAsia" w:hAnsi="Cambria Math" w:cstheme="majorBidi"/>
-            </w:rPr>
-            <m:t>=2</m:t>
-          </m:r>
-          <m:r>
-            <w:rPr>
-              <w:rFonts w:ascii="Cambria Math" w:eastAsiaTheme="majorEastAsia" w:hAnsi="Cambria Math" w:cstheme="majorBidi"/>
-            </w:rPr>
-            <m:t>A</m:t>
+            <m:t>=2×1A=2A</m:t>
           </m:r>
         </m:oMath>
       </m:oMathPara>
@@ -10489,13 +10138,7 @@
                 <w:rPr>
                   <w:rFonts w:ascii="Cambria Math" w:eastAsiaTheme="majorEastAsia" w:hAnsi="Cambria Math" w:cstheme="majorBidi"/>
                 </w:rPr>
-                <m:t>2</m:t>
-              </m:r>
-              <m:r>
-                <w:rPr>
-                  <w:rFonts w:ascii="Cambria Math" w:eastAsiaTheme="majorEastAsia" w:hAnsi="Cambria Math" w:cstheme="majorBidi"/>
-                </w:rPr>
-                <m:t>A</m:t>
+                <m:t>2A</m:t>
               </m:r>
             </m:den>
           </m:f>
@@ -10680,13 +10323,7 @@
                     <w:rPr>
                       <w:rFonts w:ascii="Cambria Math" w:eastAsiaTheme="majorEastAsia" w:hAnsi="Cambria Math" w:cstheme="majorBidi"/>
                     </w:rPr>
-                    <m:t>2</m:t>
-                  </m:r>
-                  <m:r>
-                    <w:rPr>
-                      <w:rFonts w:ascii="Cambria Math" w:eastAsiaTheme="majorEastAsia" w:hAnsi="Cambria Math" w:cstheme="majorBidi"/>
-                    </w:rPr>
-                    <m:t>A</m:t>
+                    <m:t>2A</m:t>
                   </m:r>
                 </m:e>
               </m:d>
@@ -10704,13 +10341,7 @@
             <w:rPr>
               <w:rFonts w:ascii="Cambria Math" w:eastAsiaTheme="majorEastAsia" w:hAnsi="Cambria Math" w:cstheme="majorBidi"/>
             </w:rPr>
-            <m:t>∙</m:t>
-          </m:r>
-          <m:r>
-            <w:rPr>
-              <w:rFonts w:ascii="Cambria Math" w:eastAsiaTheme="majorEastAsia" w:hAnsi="Cambria Math" w:cstheme="majorBidi"/>
-            </w:rPr>
-            <m:t xml:space="preserve"> 0.15</m:t>
+            <m:t>∙ 0.15</m:t>
           </m:r>
           <m:r>
             <m:rPr>
@@ -10725,13 +10356,7 @@
             <w:rPr>
               <w:rFonts w:ascii="Cambria Math" w:eastAsiaTheme="majorEastAsia" w:hAnsi="Cambria Math" w:cstheme="majorBidi"/>
             </w:rPr>
-            <m:t>=0.6</m:t>
-          </m:r>
-          <m:r>
-            <w:rPr>
-              <w:rFonts w:ascii="Cambria Math" w:eastAsiaTheme="majorEastAsia" w:hAnsi="Cambria Math" w:cstheme="majorBidi"/>
-            </w:rPr>
-            <m:t>W</m:t>
+            <m:t>=0.6W</m:t>
           </m:r>
         </m:oMath>
       </m:oMathPara>
@@ -10818,49 +10443,7 @@
             <w:rPr>
               <w:rFonts w:ascii="Cambria Math" w:eastAsiaTheme="majorEastAsia" w:hAnsi="Cambria Math" w:cstheme="majorBidi"/>
             </w:rPr>
-            <m:t>-</m:t>
-          </m:r>
-          <m:r>
-            <w:rPr>
-              <w:rFonts w:ascii="Cambria Math" w:eastAsiaTheme="majorEastAsia" w:hAnsi="Cambria Math" w:cstheme="majorBidi"/>
-            </w:rPr>
-            <m:t>1</m:t>
-          </m:r>
-          <m:r>
-            <w:rPr>
-              <w:rFonts w:ascii="Cambria Math" w:eastAsiaTheme="majorEastAsia" w:hAnsi="Cambria Math" w:cstheme="majorBidi"/>
-            </w:rPr>
-            <m:t>W</m:t>
-          </m:r>
-          <m:r>
-            <w:rPr>
-              <w:rFonts w:ascii="Cambria Math" w:eastAsiaTheme="majorEastAsia" w:hAnsi="Cambria Math" w:cstheme="majorBidi"/>
-            </w:rPr>
-            <m:t xml:space="preserve"> (</m:t>
-          </m:r>
-          <m:r>
-            <w:rPr>
-              <w:rFonts w:ascii="Cambria Math" w:eastAsiaTheme="majorEastAsia" w:hAnsi="Cambria Math" w:cstheme="majorBidi"/>
-            </w:rPr>
-            <m:t>Valore</m:t>
-          </m:r>
-          <m:r>
-            <w:rPr>
-              <w:rFonts w:ascii="Cambria Math" w:eastAsiaTheme="majorEastAsia" w:hAnsi="Cambria Math" w:cstheme="majorBidi"/>
-            </w:rPr>
-            <m:t xml:space="preserve"> </m:t>
-          </m:r>
-          <m:r>
-            <w:rPr>
-              <w:rFonts w:ascii="Cambria Math" w:eastAsiaTheme="majorEastAsia" w:hAnsi="Cambria Math" w:cstheme="majorBidi"/>
-            </w:rPr>
-            <m:t>comercial</m:t>
-          </m:r>
-          <m:r>
-            <w:rPr>
-              <w:rFonts w:ascii="Cambria Math" w:eastAsiaTheme="majorEastAsia" w:hAnsi="Cambria Math" w:cstheme="majorBidi"/>
-            </w:rPr>
-            <m:t>)</m:t>
+            <m:t>-1W (Valore comercial)</m:t>
           </m:r>
         </m:oMath>
       </m:oMathPara>
@@ -10973,19 +10556,7 @@
                 <w:rPr>
                   <w:rFonts w:ascii="Cambria Math" w:eastAsiaTheme="majorEastAsia" w:hAnsi="Cambria Math" w:cstheme="majorBidi"/>
                 </w:rPr>
-                <m:t>m</m:t>
-              </m:r>
-              <m:r>
-                <w:rPr>
-                  <w:rFonts w:ascii="Cambria Math" w:eastAsiaTheme="majorEastAsia" w:hAnsi="Cambria Math" w:cstheme="majorBidi"/>
-                </w:rPr>
-                <m:t>í</m:t>
-              </m:r>
-              <m:r>
-                <w:rPr>
-                  <w:rFonts w:ascii="Cambria Math" w:eastAsiaTheme="majorEastAsia" w:hAnsi="Cambria Math" w:cstheme="majorBidi"/>
-                </w:rPr>
-                <m:t>n</m:t>
+                <m:t>mín</m:t>
               </m:r>
             </m:sub>
           </m:sSub>
@@ -11208,49 +10779,7 @@
                     <w:rPr>
                       <w:rFonts w:ascii="Cambria Math" w:eastAsiaTheme="majorEastAsia" w:hAnsi="Cambria Math" w:cstheme="majorBidi"/>
                     </w:rPr>
-                    <m:t>12</m:t>
-                  </m:r>
-                  <m:r>
-                    <w:rPr>
-                      <w:rFonts w:ascii="Cambria Math" w:eastAsiaTheme="majorEastAsia" w:hAnsi="Cambria Math" w:cstheme="majorBidi"/>
-                    </w:rPr>
-                    <m:t>V</m:t>
-                  </m:r>
-                  <m:r>
-                    <w:rPr>
-                      <w:rFonts w:ascii="Cambria Math" w:eastAsiaTheme="majorEastAsia" w:hAnsi="Cambria Math" w:cstheme="majorBidi"/>
-                    </w:rPr>
-                    <m:t>-</m:t>
-                  </m:r>
-                  <m:r>
-                    <w:rPr>
-                      <w:rFonts w:ascii="Cambria Math" w:eastAsiaTheme="majorEastAsia" w:hAnsi="Cambria Math" w:cstheme="majorBidi"/>
-                    </w:rPr>
-                    <m:t>1</m:t>
-                  </m:r>
-                  <m:r>
-                    <w:rPr>
-                      <w:rFonts w:ascii="Cambria Math" w:eastAsiaTheme="majorEastAsia" w:hAnsi="Cambria Math" w:cstheme="majorBidi"/>
-                    </w:rPr>
-                    <m:t>V</m:t>
-                  </m:r>
-                  <m:r>
-                    <w:rPr>
-                      <w:rFonts w:ascii="Cambria Math" w:eastAsiaTheme="majorEastAsia" w:hAnsi="Cambria Math" w:cstheme="majorBidi"/>
-                    </w:rPr>
-                    <m:t>-</m:t>
-                  </m:r>
-                  <m:r>
-                    <w:rPr>
-                      <w:rFonts w:ascii="Cambria Math" w:eastAsiaTheme="majorEastAsia" w:hAnsi="Cambria Math" w:cstheme="majorBidi"/>
-                    </w:rPr>
-                    <m:t>5</m:t>
-                  </m:r>
-                  <m:r>
-                    <w:rPr>
-                      <w:rFonts w:ascii="Cambria Math" w:eastAsiaTheme="majorEastAsia" w:hAnsi="Cambria Math" w:cstheme="majorBidi"/>
-                    </w:rPr>
-                    <m:t>V</m:t>
+                    <m:t>12V-1V-5V</m:t>
                   </m:r>
                 </m:num>
                 <m:den>
@@ -11258,13 +10787,7 @@
                     <w:rPr>
                       <w:rFonts w:ascii="Cambria Math" w:eastAsiaTheme="majorEastAsia" w:hAnsi="Cambria Math" w:cstheme="majorBidi"/>
                     </w:rPr>
-                    <m:t>2</m:t>
-                  </m:r>
-                  <m:r>
-                    <w:rPr>
-                      <w:rFonts w:ascii="Cambria Math" w:eastAsiaTheme="majorEastAsia" w:hAnsi="Cambria Math" w:cstheme="majorBidi"/>
-                    </w:rPr>
-                    <m:t>A</m:t>
+                    <m:t>2A</m:t>
                   </m:r>
                 </m:den>
               </m:f>
@@ -11274,25 +10797,7 @@
             <w:rPr>
               <w:rFonts w:ascii="Cambria Math" w:eastAsiaTheme="majorEastAsia" w:hAnsi="Cambria Math" w:cstheme="majorBidi"/>
             </w:rPr>
-            <m:t>×11.96</m:t>
-          </m:r>
-          <m:r>
-            <w:rPr>
-              <w:rFonts w:ascii="Cambria Math" w:eastAsiaTheme="majorEastAsia" w:hAnsi="Cambria Math" w:cstheme="majorBidi"/>
-            </w:rPr>
-            <m:t>μs</m:t>
-          </m:r>
-          <m:r>
-            <w:rPr>
-              <w:rFonts w:ascii="Cambria Math" w:eastAsiaTheme="majorEastAsia" w:hAnsi="Cambria Math" w:cstheme="majorBidi"/>
-            </w:rPr>
-            <m:t>=35.88</m:t>
-          </m:r>
-          <m:r>
-            <w:rPr>
-              <w:rFonts w:ascii="Cambria Math" w:eastAsiaTheme="majorEastAsia" w:hAnsi="Cambria Math" w:cstheme="majorBidi"/>
-            </w:rPr>
-            <m:t>μH</m:t>
+            <m:t>×11.96μs=35.88μH</m:t>
           </m:r>
         </m:oMath>
       </m:oMathPara>
@@ -11474,19 +10979,7 @@
                     <w:rPr>
                       <w:rFonts w:ascii="Cambria Math" w:eastAsiaTheme="majorEastAsia" w:hAnsi="Cambria Math" w:cstheme="majorBidi"/>
                     </w:rPr>
-                    <m:t>m</m:t>
-                  </m:r>
-                  <m:r>
-                    <w:rPr>
-                      <w:rFonts w:ascii="Cambria Math" w:eastAsiaTheme="majorEastAsia" w:hAnsi="Cambria Math" w:cstheme="majorBidi"/>
-                    </w:rPr>
-                    <m:t>á</m:t>
-                  </m:r>
-                  <m:r>
-                    <w:rPr>
-                      <w:rFonts w:ascii="Cambria Math" w:eastAsiaTheme="majorEastAsia" w:hAnsi="Cambria Math" w:cstheme="majorBidi"/>
-                    </w:rPr>
-                    <m:t>x</m:t>
+                    <m:t>máx</m:t>
                   </m:r>
                 </m:e>
               </m:d>
@@ -11496,13 +10989,7 @@
             <w:rPr>
               <w:rFonts w:ascii="Cambria Math" w:eastAsiaTheme="majorEastAsia" w:hAnsi="Cambria Math" w:cstheme="majorBidi"/>
             </w:rPr>
-            <m:t>=1</m:t>
-          </m:r>
-          <m:r>
-            <w:rPr>
-              <w:rFonts w:ascii="Cambria Math" w:eastAsiaTheme="majorEastAsia" w:hAnsi="Cambria Math" w:cstheme="majorBidi"/>
-            </w:rPr>
-            <m:t>A</m:t>
+            <m:t>=1A</m:t>
           </m:r>
         </m:oMath>
       </m:oMathPara>
@@ -11828,19 +11315,7 @@
                     <w:rPr>
                       <w:rFonts w:ascii="Cambria Math" w:eastAsiaTheme="majorEastAsia" w:hAnsi="Cambria Math" w:cstheme="majorBidi"/>
                     </w:rPr>
-                    <m:t>m</m:t>
-                  </m:r>
-                  <m:r>
-                    <w:rPr>
-                      <w:rFonts w:ascii="Cambria Math" w:eastAsiaTheme="majorEastAsia" w:hAnsi="Cambria Math" w:cstheme="majorBidi"/>
-                    </w:rPr>
-                    <m:t>á</m:t>
-                  </m:r>
-                  <m:r>
-                    <w:rPr>
-                      <w:rFonts w:ascii="Cambria Math" w:eastAsiaTheme="majorEastAsia" w:hAnsi="Cambria Math" w:cstheme="majorBidi"/>
-                    </w:rPr>
-                    <m:t>x</m:t>
+                    <m:t>máx</m:t>
                   </m:r>
                 </m:e>
               </m:d>
@@ -11967,19 +11442,7 @@
             <w:rPr>
               <w:rFonts w:ascii="Cambria Math" w:eastAsiaTheme="majorEastAsia" w:hAnsi="Cambria Math" w:cstheme="majorBidi"/>
             </w:rPr>
-            <m:t>=1</m:t>
-          </m:r>
-          <m:r>
-            <w:rPr>
-              <w:rFonts w:ascii="Cambria Math" w:eastAsiaTheme="majorEastAsia" w:hAnsi="Cambria Math" w:cstheme="majorBidi"/>
-            </w:rPr>
-            <m:t>A</m:t>
-          </m:r>
-          <m:r>
-            <w:rPr>
-              <w:rFonts w:ascii="Cambria Math" w:eastAsiaTheme="majorEastAsia" w:hAnsi="Cambria Math" w:cstheme="majorBidi"/>
-            </w:rPr>
-            <m:t>+</m:t>
+            <m:t>=1A+</m:t>
           </m:r>
           <m:f>
             <m:fPr>
@@ -11996,13 +11459,7 @@
                 <w:rPr>
                   <w:rFonts w:ascii="Cambria Math" w:eastAsiaTheme="majorEastAsia" w:hAnsi="Cambria Math" w:cstheme="majorBidi"/>
                 </w:rPr>
-                <m:t>1.53</m:t>
-              </m:r>
-              <m:r>
-                <w:rPr>
-                  <w:rFonts w:ascii="Cambria Math" w:eastAsiaTheme="majorEastAsia" w:hAnsi="Cambria Math" w:cstheme="majorBidi"/>
-                </w:rPr>
-                <m:t>A</m:t>
+                <m:t>1.53A</m:t>
               </m:r>
             </m:num>
             <m:den>
@@ -12018,13 +11475,7 @@
             <w:rPr>
               <w:rFonts w:ascii="Cambria Math" w:eastAsiaTheme="majorEastAsia" w:hAnsi="Cambria Math" w:cstheme="majorBidi"/>
             </w:rPr>
-            <m:t xml:space="preserve">=1.765 </m:t>
-          </m:r>
-          <m:r>
-            <w:rPr>
-              <w:rFonts w:ascii="Cambria Math" w:eastAsiaTheme="majorEastAsia" w:hAnsi="Cambria Math" w:cstheme="majorBidi"/>
-            </w:rPr>
-            <m:t>A</m:t>
+            <m:t>=1.765 A</m:t>
           </m:r>
         </m:oMath>
       </m:oMathPara>
@@ -12396,25 +11847,7 @@
                 <w:rPr>
                   <w:rFonts w:ascii="Cambria Math" w:eastAsiaTheme="majorEastAsia" w:hAnsi="Cambria Math" w:cstheme="majorBidi"/>
                 </w:rPr>
-                <m:t>2</m:t>
-              </m:r>
-              <m:r>
-                <w:rPr>
-                  <w:rFonts w:ascii="Cambria Math" w:eastAsiaTheme="majorEastAsia" w:hAnsi="Cambria Math" w:cstheme="majorBidi"/>
-                </w:rPr>
-                <m:t>A</m:t>
-              </m:r>
-              <m:r>
-                <w:rPr>
-                  <w:rFonts w:ascii="Cambria Math" w:eastAsiaTheme="majorEastAsia" w:hAnsi="Cambria Math" w:cstheme="majorBidi"/>
-                </w:rPr>
-                <m:t>×25</m:t>
-              </m:r>
-              <m:r>
-                <w:rPr>
-                  <w:rFonts w:ascii="Cambria Math" w:eastAsiaTheme="majorEastAsia" w:hAnsi="Cambria Math" w:cstheme="majorBidi"/>
-                </w:rPr>
-                <m:t>μs</m:t>
+                <m:t>2A×25μs</m:t>
               </m:r>
             </m:num>
             <m:den>
@@ -12422,13 +11855,7 @@
                 <w:rPr>
                   <w:rFonts w:ascii="Cambria Math" w:eastAsiaTheme="majorEastAsia" w:hAnsi="Cambria Math" w:cstheme="majorBidi"/>
                 </w:rPr>
-                <m:t>8×0.025</m:t>
-              </m:r>
-              <m:r>
-                <w:rPr>
-                  <w:rFonts w:ascii="Cambria Math" w:eastAsiaTheme="majorEastAsia" w:hAnsi="Cambria Math" w:cstheme="majorBidi"/>
-                </w:rPr>
-                <m:t>V</m:t>
+                <m:t>8×0.025V</m:t>
               </m:r>
             </m:den>
           </m:f>
@@ -12436,13 +11863,7 @@
             <w:rPr>
               <w:rFonts w:ascii="Cambria Math" w:eastAsiaTheme="majorEastAsia" w:hAnsi="Cambria Math" w:cstheme="majorBidi"/>
             </w:rPr>
-            <m:t>=250</m:t>
-          </m:r>
-          <m:r>
-            <w:rPr>
-              <w:rFonts w:ascii="Cambria Math" w:eastAsiaTheme="majorEastAsia" w:hAnsi="Cambria Math" w:cstheme="majorBidi"/>
-            </w:rPr>
-            <m:t>μF</m:t>
+            <m:t>=250μF</m:t>
           </m:r>
         </m:oMath>
       </m:oMathPara>
@@ -12487,67 +11908,7 @@
             <w:rPr>
               <w:rFonts w:ascii="Cambria Math" w:eastAsiaTheme="majorEastAsia" w:hAnsi="Cambria Math" w:cstheme="majorBidi"/>
             </w:rPr>
-            <m:t>=220</m:t>
-          </m:r>
-          <m:r>
-            <w:rPr>
-              <w:rFonts w:ascii="Cambria Math" w:eastAsiaTheme="majorEastAsia" w:hAnsi="Cambria Math" w:cstheme="majorBidi"/>
-            </w:rPr>
-            <m:t>uF</m:t>
-          </m:r>
-          <m:r>
-            <w:rPr>
-              <w:rFonts w:ascii="Cambria Math" w:eastAsiaTheme="majorEastAsia" w:hAnsi="Cambria Math" w:cstheme="majorBidi"/>
-            </w:rPr>
-            <m:t>+33</m:t>
-          </m:r>
-          <m:r>
-            <w:rPr>
-              <w:rFonts w:ascii="Cambria Math" w:eastAsiaTheme="majorEastAsia" w:hAnsi="Cambria Math" w:cstheme="majorBidi"/>
-            </w:rPr>
-            <m:t>μF</m:t>
-          </m:r>
-          <m:r>
-            <w:rPr>
-              <w:rFonts w:ascii="Cambria Math" w:eastAsiaTheme="majorEastAsia" w:hAnsi="Cambria Math" w:cstheme="majorBidi"/>
-            </w:rPr>
-            <m:t xml:space="preserve"> (</m:t>
-          </m:r>
-          <m:r>
-            <w:rPr>
-              <w:rFonts w:ascii="Cambria Math" w:eastAsiaTheme="majorEastAsia" w:hAnsi="Cambria Math" w:cstheme="majorBidi"/>
-            </w:rPr>
-            <m:t>Valores</m:t>
-          </m:r>
-          <m:r>
-            <w:rPr>
-              <w:rFonts w:ascii="Cambria Math" w:eastAsiaTheme="majorEastAsia" w:hAnsi="Cambria Math" w:cstheme="majorBidi"/>
-            </w:rPr>
-            <m:t xml:space="preserve"> </m:t>
-          </m:r>
-          <m:r>
-            <w:rPr>
-              <w:rFonts w:ascii="Cambria Math" w:eastAsiaTheme="majorEastAsia" w:hAnsi="Cambria Math" w:cstheme="majorBidi"/>
-            </w:rPr>
-            <m:t>comreciales</m:t>
-          </m:r>
-          <m:r>
-            <w:rPr>
-              <w:rFonts w:ascii="Cambria Math" w:eastAsiaTheme="majorEastAsia" w:hAnsi="Cambria Math" w:cstheme="majorBidi"/>
-            </w:rPr>
-            <m:t xml:space="preserve"> </m:t>
-          </m:r>
-          <m:r>
-            <w:rPr>
-              <w:rFonts w:ascii="Cambria Math" w:eastAsiaTheme="majorEastAsia" w:hAnsi="Cambria Math" w:cstheme="majorBidi"/>
-            </w:rPr>
-            <m:t>seleccionados</m:t>
-          </m:r>
-          <m:r>
-            <w:rPr>
-              <w:rFonts w:ascii="Cambria Math" w:eastAsiaTheme="majorEastAsia" w:hAnsi="Cambria Math" w:cstheme="majorBidi"/>
-            </w:rPr>
-            <m:t>)</m:t>
+            <m:t>=220uF+33μF (Valores comreciales seleccionados)</m:t>
           </m:r>
         </m:oMath>
       </m:oMathPara>
@@ -12796,13 +12157,7 @@
             <w:rPr>
               <w:rFonts w:ascii="Cambria Math" w:eastAsiaTheme="majorEastAsia" w:hAnsi="Cambria Math" w:cstheme="majorBidi"/>
             </w:rPr>
-            <m:t>=5</m:t>
-          </m:r>
-          <m:r>
-            <w:rPr>
-              <w:rFonts w:ascii="Cambria Math" w:eastAsiaTheme="majorEastAsia" w:hAnsi="Cambria Math" w:cstheme="majorBidi"/>
-            </w:rPr>
-            <m:t>V</m:t>
+            <m:t>=5V</m:t>
           </m:r>
         </m:oMath>
       </m:oMathPara>
@@ -12982,13 +12337,7 @@
             <w:rPr>
               <w:rFonts w:ascii="Cambria Math" w:eastAsiaTheme="majorEastAsia" w:hAnsi="Cambria Math" w:cstheme="majorBidi"/>
             </w:rPr>
-            <m:t>-</m:t>
-          </m:r>
-          <m:r>
-            <w:rPr>
-              <w:rFonts w:ascii="Cambria Math" w:eastAsiaTheme="majorEastAsia" w:hAnsi="Cambria Math" w:cstheme="majorBidi"/>
-            </w:rPr>
-            <m:t>1=</m:t>
+            <m:t>-1=</m:t>
           </m:r>
           <m:f>
             <m:fPr>
@@ -13005,13 +12354,7 @@
                 <w:rPr>
                   <w:rFonts w:ascii="Cambria Math" w:eastAsiaTheme="majorEastAsia" w:hAnsi="Cambria Math" w:cstheme="majorBidi"/>
                 </w:rPr>
-                <m:t>5</m:t>
-              </m:r>
-              <m:r>
-                <w:rPr>
-                  <w:rFonts w:ascii="Cambria Math" w:eastAsiaTheme="majorEastAsia" w:hAnsi="Cambria Math" w:cstheme="majorBidi"/>
-                </w:rPr>
-                <m:t>V</m:t>
+                <m:t>5V</m:t>
               </m:r>
             </m:num>
             <m:den>
@@ -13019,13 +12362,7 @@
                 <w:rPr>
                   <w:rFonts w:ascii="Cambria Math" w:eastAsiaTheme="majorEastAsia" w:hAnsi="Cambria Math" w:cstheme="majorBidi"/>
                 </w:rPr>
-                <m:t>1.25</m:t>
-              </m:r>
-              <m:r>
-                <w:rPr>
-                  <w:rFonts w:ascii="Cambria Math" w:eastAsiaTheme="majorEastAsia" w:hAnsi="Cambria Math" w:cstheme="majorBidi"/>
-                </w:rPr>
-                <m:t>V</m:t>
+                <m:t>1.25V</m:t>
               </m:r>
             </m:den>
           </m:f>
@@ -13033,13 +12370,7 @@
             <w:rPr>
               <w:rFonts w:ascii="Cambria Math" w:eastAsiaTheme="majorEastAsia" w:hAnsi="Cambria Math" w:cstheme="majorBidi"/>
             </w:rPr>
-            <m:t>-</m:t>
-          </m:r>
-          <m:r>
-            <w:rPr>
-              <w:rFonts w:ascii="Cambria Math" w:eastAsiaTheme="majorEastAsia" w:hAnsi="Cambria Math" w:cstheme="majorBidi"/>
-            </w:rPr>
-            <m:t>1=3</m:t>
+            <m:t>-1=3</m:t>
           </m:r>
         </m:oMath>
       </m:oMathPara>
@@ -13102,13 +12433,7 @@
             <w:rPr>
               <w:rFonts w:ascii="Cambria Math" w:eastAsiaTheme="majorEastAsia" w:hAnsi="Cambria Math" w:cstheme="majorBidi"/>
             </w:rPr>
-            <m:t>=11</m:t>
-          </m:r>
-          <m:r>
-            <w:rPr>
-              <w:rFonts w:ascii="Cambria Math" w:eastAsiaTheme="majorEastAsia" w:hAnsi="Cambria Math" w:cstheme="majorBidi"/>
-            </w:rPr>
-            <m:t>K</m:t>
+            <m:t>=11K</m:t>
           </m:r>
           <m:r>
             <m:rPr>
@@ -13156,13 +12481,7 @@
             <w:rPr>
               <w:rFonts w:ascii="Cambria Math" w:eastAsiaTheme="majorEastAsia" w:hAnsi="Cambria Math" w:cstheme="majorBidi"/>
             </w:rPr>
-            <m:t>=33</m:t>
-          </m:r>
-          <m:r>
-            <w:rPr>
-              <w:rFonts w:ascii="Cambria Math" w:eastAsiaTheme="majorEastAsia" w:hAnsi="Cambria Math" w:cstheme="majorBidi"/>
-            </w:rPr>
-            <m:t>K</m:t>
+            <m:t>=33K</m:t>
           </m:r>
           <m:r>
             <m:rPr>

</xml_diff>